<commit_message>
docs(sesion-7): informe completo de los tres laboratorios
Despliegue real a staging y produccion, ambientes separados con su propia
base de datos y secretos, y el simulacro de caos completo: fallo
provocado, diagnostico con logs, rollback y correccion por el flujo
normal. Incluye los hallazgos de tokens de Railway y de railway.json.

Co-Authored-By: Claude Opus 5 <noreply@anthropic.com>
</commit_message>
<xml_diff>
--- a/docs/sesion-7/Informe_Sesion7_Albert_Araya.docx
+++ b/docs/sesion-7/Informe_Sesion7_Albert_Araya.docx
@@ -161,7 +161,7 @@
                 <w:color w:val="1F4E79"/>
                 <w:sz w:val="22"/>
               </w:rPr>
-              <w:t>Pull Request</w:t>
+              <w:t>Pull Requests</w:t>
             </w:r>
           </w:p>
         </w:tc>
@@ -177,7 +177,7 @@
               <w:rPr>
                 <w:sz w:val="22"/>
               </w:rPr>
-              <w:t>#10 — integrado a main (4bd5b86)</w:t>
+              <w:t>#10, #12 a #16</w:t>
             </w:r>
           </w:p>
         </w:tc>
@@ -213,7 +213,7 @@
               <w:rPr>
                 <w:sz w:val="22"/>
               </w:rPr>
-              <w:t>brave-renewal — servicio + PostgreSQL</w:t>
+              <w:t>brave-renewal — ambientes staging y production</w:t>
             </w:r>
           </w:p>
         </w:tc>
@@ -233,7 +233,43 @@
                 <w:color w:val="1F4E79"/>
                 <w:sz w:val="22"/>
               </w:rPr>
-              <w:t>URL pública</w:t>
+              <w:t>Staging</w:t>
+            </w:r>
+          </w:p>
+        </w:tc>
+        <w:tc>
+          <w:tcPr>
+            <w:tcW w:type="dxa" w:w="6192"/>
+          </w:tcPr>
+          <w:p>
+            <w:pPr>
+              <w:spacing w:after="80"/>
+            </w:pPr>
+            <w:r>
+              <w:rPr>
+                <w:sz w:val="22"/>
+              </w:rPr>
+              <w:t>fullstack-lab-1-1ci-cd-staging.up.railway.app</w:t>
+            </w:r>
+          </w:p>
+        </w:tc>
+      </w:tr>
+      <w:tr>
+        <w:tc>
+          <w:tcPr>
+            <w:tcW w:type="dxa" w:w="2448"/>
+          </w:tcPr>
+          <w:p>
+            <w:pPr>
+              <w:spacing w:after="80"/>
+            </w:pPr>
+            <w:r>
+              <w:rPr>
+                <w:b/>
+                <w:color w:val="1F4E79"/>
+                <w:sz w:val="22"/>
+              </w:rPr>
+              <w:t>Producción</w:t>
             </w:r>
           </w:p>
         </w:tc>
@@ -321,7 +357,7 @@
               <w:rPr>
                 <w:sz w:val="22"/>
               </w:rPr>
-              <w:t>21 de septiembre de 2026</w:t>
+              <w:t>22 de septiembre de 2026</w:t>
             </w:r>
           </w:p>
         </w:tc>
@@ -357,7 +393,7 @@
           <w:color w:val="1E7B34"/>
           <w:sz w:val="22"/>
         </w:rPr>
-        <w:t>Pipeline de despliegue construido y verificado · Infraestructura creada en Railway</w:t>
+        <w:t>Los tres laboratorios completos · Despliegue real en staging y producción</w:t>
       </w:r>
     </w:p>
     <w:p>
@@ -369,10 +405,10 @@
         <w:rPr>
           <w:b/>
           <w:i w:val="0"/>
-          <w:color w:val="B56B00"/>
+          <w:color w:val="1E7B34"/>
           <w:sz w:val="20"/>
         </w:rPr>
-        <w:t>El despliegue efectivo queda a la espera del RAILWAY_TOKEN — ver la sección de pendientes</w:t>
+        <w:t>Incidente provocado, diagnosticado, revertido y corregido por el flujo normal</w:t>
       </w:r>
     </w:p>
     <w:p>
@@ -521,9 +557,11 @@
             <w:r/>
             <w:r>
               <w:rPr>
+                <w:b/>
+                <w:color w:val="1E7B34"/>
                 <w:sz w:val="20"/>
               </w:rPr>
-              <w:t>Parcial</w:t>
+              <w:t>Cumplido</w:t>
             </w:r>
           </w:p>
         </w:tc>
@@ -574,9 +612,11 @@
             <w:r/>
             <w:r>
               <w:rPr>
+                <w:b/>
+                <w:color w:val="1E7B34"/>
                 <w:sz w:val="20"/>
               </w:rPr>
-              <w:t>Parcial</w:t>
+              <w:t>Cumplido</w:t>
             </w:r>
           </w:p>
         </w:tc>
@@ -628,10 +668,10 @@
             <w:r>
               <w:rPr>
                 <w:b/>
-                <w:color w:val="B56B00"/>
+                <w:color w:val="1E7B34"/>
                 <w:sz w:val="20"/>
               </w:rPr>
-              <w:t>Pendiente</w:t>
+              <w:t>Cumplido</w:t>
             </w:r>
           </w:p>
         </w:tc>
@@ -644,24 +684,23 @@
     </w:p>
     <w:p>
       <w:pPr>
+        <w:pStyle w:val="Heading2"/>
+      </w:pPr>
+      <w:r>
+        <w:t>Lo que costó llegar al primer despliegue real</w:t>
+      </w:r>
+    </w:p>
+    <w:p>
+      <w:pPr>
         <w:spacing w:after="120"/>
       </w:pPr>
       <w:r>
         <w:rPr>
-          <w:b/>
+          <w:b w:val="0"/>
+          <w:i w:val="0"/>
+          <w:sz w:val="22"/>
         </w:rPr>
-        <w:t xml:space="preserve">Por qué queda trabajo pendiente: </w:t>
-      </w:r>
-      <w:r>
-        <w:t>dos pasos de esta sesión no los puede ejecutar un asistente y corresponden a la persona dueña de la cuenta — generar el token de Railway y cargarlo como Secret en GitHub. Un token de despliegue es una credencial real: quien la tiene puede publicar código en producción. Todo lo que no depende de ese token está hecho, probado y documentado en este informe.</w:t>
-      </w:r>
-    </w:p>
-    <w:p>
-      <w:pPr>
-        <w:pStyle w:val="Heading2"/>
-      </w:pPr>
-      <w:r>
-        <w:t>Lo que sí quedó funcionando</w:t>
+        <w:t>Conectar el pipeline con Railway no salió a la primera. Cada intento fallido dejó un error concreto en el log, y cada uno se resolvió con un Pull Request propio:</w:t>
       </w:r>
     </w:p>
     <w:tbl>
@@ -672,13 +711,15 @@
         <w:tblLook w:firstColumn="1" w:firstRow="1" w:lastColumn="0" w:lastRow="0" w:noHBand="0" w:noVBand="1" w:val="04A0"/>
       </w:tblPr>
       <w:tblGrid>
-        <w:gridCol w:w="4680"/>
-        <w:gridCol w:w="4680"/>
+        <w:gridCol w:w="2340"/>
+        <w:gridCol w:w="2340"/>
+        <w:gridCol w:w="2340"/>
+        <w:gridCol w:w="2340"/>
       </w:tblGrid>
       <w:tr>
         <w:tc>
           <w:tcPr>
-            <w:tcW w:type="dxa" w:w="7200"/>
+            <w:tcW w:type="dxa" w:w="1008"/>
             <w:shd w:val="clear" w:color="auto" w:fill="1F4E79"/>
           </w:tcPr>
           <w:p>
@@ -692,13 +733,13 @@
                 <w:color w:val="FFFFFF"/>
                 <w:sz w:val="20"/>
               </w:rPr>
-              <w:t>Elemento</w:t>
+              <w:t>Intento</w:t>
             </w:r>
           </w:p>
         </w:tc>
         <w:tc>
           <w:tcPr>
-            <w:tcW w:type="dxa" w:w="2160"/>
+            <w:tcW w:type="dxa" w:w="2736"/>
             <w:shd w:val="clear" w:color="auto" w:fill="1F4E79"/>
           </w:tcPr>
           <w:p>
@@ -712,7 +753,47 @@
                 <w:color w:val="FFFFFF"/>
                 <w:sz w:val="20"/>
               </w:rPr>
-              <w:t>Estado</w:t>
+              <w:t>Qué respondió Railway</w:t>
+            </w:r>
+          </w:p>
+        </w:tc>
+        <w:tc>
+          <w:tcPr>
+            <w:tcW w:type="dxa" w:w="3312"/>
+            <w:shd w:val="clear" w:color="auto" w:fill="1F4E79"/>
+          </w:tcPr>
+          <w:p>
+            <w:pPr>
+              <w:spacing w:after="40"/>
+            </w:pPr>
+            <w:r/>
+            <w:r>
+              <w:rPr>
+                <w:b/>
+                <w:color w:val="FFFFFF"/>
+                <w:sz w:val="20"/>
+              </w:rPr>
+              <w:t>Causa</w:t>
+            </w:r>
+          </w:p>
+        </w:tc>
+        <w:tc>
+          <w:tcPr>
+            <w:tcW w:type="dxa" w:w="2304"/>
+            <w:shd w:val="clear" w:color="auto" w:fill="1F4E79"/>
+          </w:tcPr>
+          <w:p>
+            <w:pPr>
+              <w:spacing w:after="40"/>
+            </w:pPr>
+            <w:r/>
+            <w:r>
+              <w:rPr>
+                <w:b/>
+                <w:color w:val="FFFFFF"/>
+                <w:sz w:val="20"/>
+              </w:rPr>
+              <w:t>Corrección</w:t>
             </w:r>
           </w:p>
         </w:tc>
@@ -720,7 +801,7 @@
       <w:tr>
         <w:tc>
           <w:tcPr>
-            <w:tcW w:type="dxa" w:w="7200"/>
+            <w:tcW w:type="dxa" w:w="1008"/>
           </w:tcPr>
           <w:p>
             <w:pPr>
@@ -731,34 +812,13 @@
               <w:rPr>
                 <w:sz w:val="20"/>
               </w:rPr>
-              <w:t>Proyecto en Railway conectado al repositorio</w:t>
+              <w:t>1</w:t>
             </w:r>
           </w:p>
         </w:tc>
         <w:tc>
           <w:tcPr>
-            <w:tcW w:type="dxa" w:w="2160"/>
-          </w:tcPr>
-          <w:p>
-            <w:pPr>
-              <w:spacing w:after="40"/>
-            </w:pPr>
-            <w:r/>
-            <w:r>
-              <w:rPr>
-                <w:b/>
-                <w:color w:val="1E7B34"/>
-                <w:sz w:val="20"/>
-              </w:rPr>
-              <w:t>Cumplido</w:t>
-            </w:r>
-          </w:p>
-        </w:tc>
-      </w:tr>
-      <w:tr>
-        <w:tc>
-          <w:tcPr>
-            <w:tcW w:type="dxa" w:w="7200"/>
+            <w:tcW w:type="dxa" w:w="2736"/>
           </w:tcPr>
           <w:p>
             <w:pPr>
@@ -769,34 +829,13 @@
               <w:rPr>
                 <w:sz w:val="20"/>
               </w:rPr>
-              <w:t>Plugin de PostgreSQL aprovisionado y en línea</w:t>
+              <w:t>El job se omitía con un aviso</w:t>
             </w:r>
           </w:p>
         </w:tc>
         <w:tc>
           <w:tcPr>
-            <w:tcW w:type="dxa" w:w="2160"/>
-          </w:tcPr>
-          <w:p>
-            <w:pPr>
-              <w:spacing w:after="40"/>
-            </w:pPr>
-            <w:r/>
-            <w:r>
-              <w:rPr>
-                <w:b/>
-                <w:color w:val="1E7B34"/>
-                <w:sz w:val="20"/>
-              </w:rPr>
-              <w:t>Cumplido</w:t>
-            </w:r>
-          </w:p>
-        </w:tc>
-      </w:tr>
-      <w:tr>
-        <w:tc>
-          <w:tcPr>
-            <w:tcW w:type="dxa" w:w="7200"/>
+            <w:tcW w:type="dxa" w:w="3312"/>
           </w:tcPr>
           <w:p>
             <w:pPr>
@@ -807,34 +846,13 @@
               <w:rPr>
                 <w:sz w:val="20"/>
               </w:rPr>
-              <w:t>Variables de entorno del servicio, enlazadas al plugin</w:t>
+              <w:t>No existía el Secret RAILWAY_TOKEN</w:t>
             </w:r>
           </w:p>
         </w:tc>
         <w:tc>
           <w:tcPr>
-            <w:tcW w:type="dxa" w:w="2160"/>
-          </w:tcPr>
-          <w:p>
-            <w:pPr>
-              <w:spacing w:after="40"/>
-            </w:pPr>
-            <w:r/>
-            <w:r>
-              <w:rPr>
-                <w:b/>
-                <w:color w:val="1E7B34"/>
-                <w:sz w:val="20"/>
-              </w:rPr>
-              <w:t>Cumplido</w:t>
-            </w:r>
-          </w:p>
-        </w:tc>
-      </w:tr>
-      <w:tr>
-        <w:tc>
-          <w:tcPr>
-            <w:tcW w:type="dxa" w:w="7200"/>
+            <w:tcW w:type="dxa" w:w="2304"/>
           </w:tcPr>
           <w:p>
             <w:pPr>
@@ -845,26 +863,7 @@
               <w:rPr>
                 <w:sz w:val="20"/>
               </w:rPr>
-              <w:t>Dominio público generado, apuntando al puerto 4000</w:t>
-            </w:r>
-          </w:p>
-        </w:tc>
-        <w:tc>
-          <w:tcPr>
-            <w:tcW w:type="dxa" w:w="2160"/>
-          </w:tcPr>
-          <w:p>
-            <w:pPr>
-              <w:spacing w:after="40"/>
-            </w:pPr>
-            <w:r/>
-            <w:r>
-              <w:rPr>
-                <w:b/>
-                <w:color w:val="1E7B34"/>
-                <w:sz w:val="20"/>
-              </w:rPr>
-              <w:t>Cumplido</w:t>
+              <w:t>Cargar el Secret en GitHub</w:t>
             </w:r>
           </w:p>
         </w:tc>
@@ -872,7 +871,7 @@
       <w:tr>
         <w:tc>
           <w:tcPr>
-            <w:tcW w:type="dxa" w:w="7200"/>
+            <w:tcW w:type="dxa" w:w="1008"/>
           </w:tcPr>
           <w:p>
             <w:pPr>
@@ -883,34 +882,13 @@
               <w:rPr>
                 <w:sz w:val="20"/>
               </w:rPr>
-              <w:t>Ruta /health en el código, verificada dentro del contenedor</w:t>
+              <w:t>2</w:t>
             </w:r>
           </w:p>
         </w:tc>
         <w:tc>
           <w:tcPr>
-            <w:tcW w:type="dxa" w:w="2160"/>
-          </w:tcPr>
-          <w:p>
-            <w:pPr>
-              <w:spacing w:after="40"/>
-            </w:pPr>
-            <w:r/>
-            <w:r>
-              <w:rPr>
-                <w:b/>
-                <w:color w:val="1E7B34"/>
-                <w:sz w:val="20"/>
-              </w:rPr>
-              <w:t>Cumplido</w:t>
-            </w:r>
-          </w:p>
-        </w:tc>
-      </w:tr>
-      <w:tr>
-        <w:tc>
-          <w:tcPr>
-            <w:tcW w:type="dxa" w:w="7200"/>
+            <w:tcW w:type="dxa" w:w="2736"/>
           </w:tcPr>
           <w:p>
             <w:pPr>
@@ -921,34 +899,13 @@
               <w:rPr>
                 <w:sz w:val="20"/>
               </w:rPr>
-              <w:t>railway.json con el Dockerfile y el healthcheck path</w:t>
+              <w:t>Invalid RAILWAY_TOKEN</w:t>
             </w:r>
           </w:p>
         </w:tc>
         <w:tc>
           <w:tcPr>
-            <w:tcW w:type="dxa" w:w="2160"/>
-          </w:tcPr>
-          <w:p>
-            <w:pPr>
-              <w:spacing w:after="40"/>
-            </w:pPr>
-            <w:r/>
-            <w:r>
-              <w:rPr>
-                <w:b/>
-                <w:color w:val="1E7B34"/>
-                <w:sz w:val="20"/>
-              </w:rPr>
-              <w:t>Cumplido</w:t>
-            </w:r>
-          </w:p>
-        </w:tc>
-      </w:tr>
-      <w:tr>
-        <w:tc>
-          <w:tcPr>
-            <w:tcW w:type="dxa" w:w="7200"/>
+            <w:tcW w:type="dxa" w:w="3312"/>
           </w:tcPr>
           <w:p>
             <w:pPr>
@@ -959,34 +916,13 @@
               <w:rPr>
                 <w:sz w:val="20"/>
               </w:rPr>
-              <w:t>Job deploy-staging: corre solo tras un push a main</w:t>
+              <w:t>El servicio se llama fullstack-lab-1-1ci-cd, no backend; y el token era de workspace</w:t>
             </w:r>
           </w:p>
         </w:tc>
         <w:tc>
           <w:tcPr>
-            <w:tcW w:type="dxa" w:w="2160"/>
-          </w:tcPr>
-          <w:p>
-            <w:pPr>
-              <w:spacing w:after="40"/>
-            </w:pPr>
-            <w:r/>
-            <w:r>
-              <w:rPr>
-                <w:b/>
-                <w:color w:val="1E7B34"/>
-                <w:sz w:val="20"/>
-              </w:rPr>
-              <w:t>Cumplido</w:t>
-            </w:r>
-          </w:p>
-        </w:tc>
-      </w:tr>
-      <w:tr>
-        <w:tc>
-          <w:tcPr>
-            <w:tcW w:type="dxa" w:w="7200"/>
+            <w:tcW w:type="dxa" w:w="2304"/>
           </w:tcPr>
           <w:p>
             <w:pPr>
@@ -997,26 +933,7 @@
               <w:rPr>
                 <w:sz w:val="20"/>
               </w:rPr>
-              <w:t>Job deploy-produccion: exige disparo manual con confirmación</w:t>
-            </w:r>
-          </w:p>
-        </w:tc>
-        <w:tc>
-          <w:tcPr>
-            <w:tcW w:type="dxa" w:w="2160"/>
-          </w:tcPr>
-          <w:p>
-            <w:pPr>
-              <w:spacing w:after="40"/>
-            </w:pPr>
-            <w:r/>
-            <w:r>
-              <w:rPr>
-                <w:b/>
-                <w:color w:val="1E7B34"/>
-                <w:sz w:val="20"/>
-              </w:rPr>
-              <w:t>Cumplido</w:t>
+              <w:t>PR #12: nombre real del servicio</w:t>
             </w:r>
           </w:p>
         </w:tc>
@@ -1024,7 +941,7 @@
       <w:tr>
         <w:tc>
           <w:tcPr>
-            <w:tcW w:type="dxa" w:w="7200"/>
+            <w:tcW w:type="dxa" w:w="1008"/>
           </w:tcPr>
           <w:p>
             <w:pPr>
@@ -1035,34 +952,13 @@
               <w:rPr>
                 <w:sz w:val="20"/>
               </w:rPr>
-              <w:t>Ejecución real de railway up</w:t>
+              <w:t>3</w:t>
             </w:r>
           </w:p>
         </w:tc>
         <w:tc>
           <w:tcPr>
-            <w:tcW w:type="dxa" w:w="2160"/>
-          </w:tcPr>
-          <w:p>
-            <w:pPr>
-              <w:spacing w:after="40"/>
-            </w:pPr>
-            <w:r/>
-            <w:r>
-              <w:rPr>
-                <w:b/>
-                <w:color w:val="B56B00"/>
-                <w:sz w:val="20"/>
-              </w:rPr>
-              <w:t>Pendiente: token</w:t>
-            </w:r>
-          </w:p>
-        </w:tc>
-      </w:tr>
-      <w:tr>
-        <w:tc>
-          <w:tcPr>
-            <w:tcW w:type="dxa" w:w="7200"/>
+            <w:tcW w:type="dxa" w:w="2736"/>
           </w:tcPr>
           <w:p>
             <w:pPr>
@@ -1073,34 +969,13 @@
               <w:rPr>
                 <w:sz w:val="20"/>
               </w:rPr>
-              <w:t>Ambiente production separado en Railway</w:t>
+              <w:t>Unauthorized</w:t>
             </w:r>
           </w:p>
         </w:tc>
         <w:tc>
           <w:tcPr>
-            <w:tcW w:type="dxa" w:w="2160"/>
-          </w:tcPr>
-          <w:p>
-            <w:pPr>
-              <w:spacing w:after="40"/>
-            </w:pPr>
-            <w:r/>
-            <w:r>
-              <w:rPr>
-                <w:b/>
-                <w:color w:val="B56B00"/>
-                <w:sz w:val="20"/>
-              </w:rPr>
-              <w:t>Pendiente: token</w:t>
-            </w:r>
-          </w:p>
-        </w:tc>
-      </w:tr>
-      <w:tr>
-        <w:tc>
-          <w:tcPr>
-            <w:tcW w:type="dxa" w:w="7200"/>
+            <w:tcW w:type="dxa" w:w="3312"/>
           </w:tcPr>
           <w:p>
             <w:pPr>
@@ -1111,13 +986,13 @@
               <w:rPr>
                 <w:sz w:val="20"/>
               </w:rPr>
-              <w:t>Simulacro de caos y rollback</w:t>
+              <w:t>Un token de workspace no sirve para railway up, ni como RAILWAY_API_TOKEN</w:t>
             </w:r>
           </w:p>
         </w:tc>
         <w:tc>
           <w:tcPr>
-            <w:tcW w:type="dxa" w:w="2160"/>
+            <w:tcW w:type="dxa" w:w="2304"/>
           </w:tcPr>
           <w:p>
             <w:pPr>
@@ -1126,11 +1001,149 @@
             <w:r/>
             <w:r>
               <w:rPr>
-                <w:b/>
-                <w:color w:val="B56B00"/>
                 <w:sz w:val="20"/>
               </w:rPr>
-              <w:t>Pendiente: token</w:t>
+              <w:t>PR #13, descartado después</w:t>
+            </w:r>
+          </w:p>
+        </w:tc>
+      </w:tr>
+      <w:tr>
+        <w:tc>
+          <w:tcPr>
+            <w:tcW w:type="dxa" w:w="1008"/>
+          </w:tcPr>
+          <w:p>
+            <w:pPr>
+              <w:spacing w:after="40"/>
+            </w:pPr>
+            <w:r/>
+            <w:r>
+              <w:rPr>
+                <w:sz w:val="20"/>
+              </w:rPr>
+              <w:t>4</w:t>
+            </w:r>
+          </w:p>
+        </w:tc>
+        <w:tc>
+          <w:tcPr>
+            <w:tcW w:type="dxa" w:w="2736"/>
+          </w:tcPr>
+          <w:p>
+            <w:pPr>
+              <w:spacing w:after="40"/>
+            </w:pPr>
+            <w:r/>
+            <w:r>
+              <w:rPr>
+                <w:sz w:val="20"/>
+              </w:rPr>
+              <w:t>Deploying as astro static site</w:t>
+            </w:r>
+          </w:p>
+        </w:tc>
+        <w:tc>
+          <w:tcPr>
+            <w:tcW w:type="dxa" w:w="3312"/>
+          </w:tcPr>
+          <w:p>
+            <w:pPr>
+              <w:spacing w:after="40"/>
+            </w:pPr>
+            <w:r/>
+            <w:r>
+              <w:rPr>
+                <w:sz w:val="20"/>
+              </w:rPr>
+              <w:t>Railway ya no lee railway.json en servicios nuevos</w:t>
+            </w:r>
+          </w:p>
+        </w:tc>
+        <w:tc>
+          <w:tcPr>
+            <w:tcW w:type="dxa" w:w="2304"/>
+          </w:tcPr>
+          <w:p>
+            <w:pPr>
+              <w:spacing w:after="40"/>
+            </w:pPr>
+            <w:r/>
+            <w:r>
+              <w:rPr>
+                <w:sz w:val="20"/>
+              </w:rPr>
+              <w:t>Configurar el servicio en el panel</w:t>
+            </w:r>
+          </w:p>
+        </w:tc>
+      </w:tr>
+      <w:tr>
+        <w:tc>
+          <w:tcPr>
+            <w:tcW w:type="dxa" w:w="1008"/>
+          </w:tcPr>
+          <w:p>
+            <w:pPr>
+              <w:spacing w:after="40"/>
+            </w:pPr>
+            <w:r/>
+            <w:r>
+              <w:rPr>
+                <w:sz w:val="20"/>
+              </w:rPr>
+              <w:t>5</w:t>
+            </w:r>
+          </w:p>
+        </w:tc>
+        <w:tc>
+          <w:tcPr>
+            <w:tcW w:type="dxa" w:w="2736"/>
+          </w:tcPr>
+          <w:p>
+            <w:pPr>
+              <w:spacing w:after="40"/>
+            </w:pPr>
+            <w:r/>
+            <w:r>
+              <w:rPr>
+                <w:sz w:val="20"/>
+              </w:rPr>
+              <w:t>Healthcheck succeeded! Deploy complete</w:t>
+            </w:r>
+          </w:p>
+        </w:tc>
+        <w:tc>
+          <w:tcPr>
+            <w:tcW w:type="dxa" w:w="3312"/>
+          </w:tcPr>
+          <w:p>
+            <w:pPr>
+              <w:spacing w:after="40"/>
+            </w:pPr>
+            <w:r/>
+            <w:r>
+              <w:rPr>
+                <w:sz w:val="20"/>
+              </w:rPr>
+              <w:t>—</w:t>
+            </w:r>
+          </w:p>
+        </w:tc>
+        <w:tc>
+          <w:tcPr>
+            <w:tcW w:type="dxa" w:w="2304"/>
+          </w:tcPr>
+          <w:p>
+            <w:pPr>
+              <w:spacing w:after="40"/>
+            </w:pPr>
+            <w:r/>
+            <w:r>
+              <w:rPr>
+                <w:sz w:val="20"/>
+              </w:rPr>
+              <w:t>PR #14: un token de proyecto por ambiente</w:t>
             </w:r>
           </w:p>
         </w:tc>
@@ -1173,7 +1186,7 @@
         <w:pStyle w:val="Heading2"/>
       </w:pPr>
       <w:r>
-        <w:t>Punto de partida</w:t>
+        <w:t>Proyecto, base de datos y variables</w:t>
       </w:r>
     </w:p>
     <w:p>
@@ -1227,39 +1240,7 @@
           <w:color w:val="595959"/>
           <w:sz w:val="18"/>
         </w:rPr>
-        <w:t>Figura 1. La cuenta de Railway antes de empezar: plan TRIAL con $5.00 y 30 días, y cero proyectos.</w:t>
-      </w:r>
-    </w:p>
-    <w:p>
-      <w:pPr>
-        <w:spacing w:after="120"/>
-      </w:pPr>
-      <w:r>
-        <w:rPr>
-          <w:i/>
-        </w:rPr>
-        <w:t>Antes de crear nada se pidió autorización expresa, porque aprovisionar servicios consume el crédito de prueba y Railway solicita acceso al repositorio.</w:t>
-      </w:r>
-    </w:p>
-    <w:p>
-      <w:pPr>
-        <w:pStyle w:val="Heading2"/>
-      </w:pPr>
-      <w:r>
-        <w:t>Creación del proyecto y la base de datos</w:t>
-      </w:r>
-    </w:p>
-    <w:p>
-      <w:pPr>
-        <w:spacing w:after="120"/>
-      </w:pPr>
-      <w:r>
-        <w:rPr>
-          <w:b w:val="0"/>
-          <w:i w:val="0"/>
-          <w:sz w:val="22"/>
-        </w:rPr>
-        <w:t>El repositorio es público, así que Railway lo reconoció pegando su URL, sin necesidad de instalar la GitHub App. Enseguida se agregó el plugin de PostgreSQL, que es la base de datos real de staging — distinta de la efímera que usa el pipeline en cada ejecución (Sesión 6).</w:t>
+        <w:t>Figura 1. La cuenta de Railway antes de empezar: plan TRIAL con $5.00 y ningún proyecto.</w:t>
       </w:r>
     </w:p>
     <w:p>
@@ -1313,15 +1294,7 @@
           <w:color w:val="595959"/>
           <w:sz w:val="18"/>
         </w:rPr>
-        <w:t>Figura 2. PostgreSQL aprovisionándose junto al servicio, con su volumen postgres-volume para conservar los datos.</w:t>
-      </w:r>
-    </w:p>
-    <w:p>
-      <w:pPr>
-        <w:pStyle w:val="Heading2"/>
-      </w:pPr>
-      <w:r>
-        <w:t>Variables de entorno</w:t>
+        <w:t>Figura 2. PostgreSQL aprovisionándose junto al servicio, con su volumen para conservar los datos.</w:t>
       </w:r>
     </w:p>
     <w:tbl>
@@ -1339,7 +1312,7 @@
       <w:tr>
         <w:tc>
           <w:tcPr>
-            <w:tcW w:type="dxa" w:w="2016"/>
+            <w:tcW w:type="dxa" w:w="2736"/>
             <w:shd w:val="clear" w:color="auto" w:fill="1F4E79"/>
           </w:tcPr>
           <w:p>
@@ -1359,7 +1332,7 @@
         </w:tc>
         <w:tc>
           <w:tcPr>
-            <w:tcW w:type="dxa" w:w="3024"/>
+            <w:tcW w:type="dxa" w:w="2736"/>
             <w:shd w:val="clear" w:color="auto" w:fill="1F4E79"/>
           </w:tcPr>
           <w:p>
@@ -1379,7 +1352,7 @@
         </w:tc>
         <w:tc>
           <w:tcPr>
-            <w:tcW w:type="dxa" w:w="4320"/>
+            <w:tcW w:type="dxa" w:w="3888"/>
             <w:shd w:val="clear" w:color="auto" w:fill="1F4E79"/>
           </w:tcPr>
           <w:p>
@@ -1401,7 +1374,7 @@
       <w:tr>
         <w:tc>
           <w:tcPr>
-            <w:tcW w:type="dxa" w:w="2016"/>
+            <w:tcW w:type="dxa" w:w="2736"/>
           </w:tcPr>
           <w:p>
             <w:pPr>
@@ -1418,7 +1391,7 @@
         </w:tc>
         <w:tc>
           <w:tcPr>
-            <w:tcW w:type="dxa" w:w="3024"/>
+            <w:tcW w:type="dxa" w:w="2736"/>
           </w:tcPr>
           <w:p>
             <w:pPr>
@@ -1435,7 +1408,7 @@
         </w:tc>
         <w:tc>
           <w:tcPr>
-            <w:tcW w:type="dxa" w:w="4320"/>
+            <w:tcW w:type="dxa" w:w="3888"/>
           </w:tcPr>
           <w:p>
             <w:pPr>
@@ -1454,7 +1427,7 @@
       <w:tr>
         <w:tc>
           <w:tcPr>
-            <w:tcW w:type="dxa" w:w="2016"/>
+            <w:tcW w:type="dxa" w:w="2736"/>
           </w:tcPr>
           <w:p>
             <w:pPr>
@@ -1471,7 +1444,7 @@
         </w:tc>
         <w:tc>
           <w:tcPr>
-            <w:tcW w:type="dxa" w:w="3024"/>
+            <w:tcW w:type="dxa" w:w="2736"/>
           </w:tcPr>
           <w:p>
             <w:pPr>
@@ -1482,13 +1455,13 @@
               <w:rPr>
                 <w:sz w:val="20"/>
               </w:rPr>
-              <w:t>Valor propio de staging</w:t>
+              <w:t>Propio de cada ambiente</w:t>
             </w:r>
           </w:p>
         </w:tc>
         <w:tc>
           <w:tcPr>
-            <w:tcW w:type="dxa" w:w="4320"/>
+            <w:tcW w:type="dxa" w:w="3888"/>
           </w:tcPr>
           <w:p>
             <w:pPr>
@@ -1499,7 +1472,7 @@
               <w:rPr>
                 <w:sz w:val="20"/>
               </w:rPr>
-              <w:t>Distinto del de desarrollo local, como exige la guía</w:t>
+              <w:t>En staging lo genera Railway con ${{secret(48)}}: distinto del de producción y nadie lo ve</w:t>
             </w:r>
           </w:p>
         </w:tc>
@@ -1507,7 +1480,7 @@
       <w:tr>
         <w:tc>
           <w:tcPr>
-            <w:tcW w:type="dxa" w:w="2016"/>
+            <w:tcW w:type="dxa" w:w="2736"/>
           </w:tcPr>
           <w:p>
             <w:pPr>
@@ -1524,7 +1497,7 @@
         </w:tc>
         <w:tc>
           <w:tcPr>
-            <w:tcW w:type="dxa" w:w="3024"/>
+            <w:tcW w:type="dxa" w:w="2736"/>
           </w:tcPr>
           <w:p>
             <w:pPr>
@@ -1541,7 +1514,7 @@
         </w:tc>
         <w:tc>
           <w:tcPr>
-            <w:tcW w:type="dxa" w:w="4320"/>
+            <w:tcW w:type="dxa" w:w="3888"/>
           </w:tcPr>
           <w:p>
             <w:pPr>
@@ -1552,7 +1525,60 @@
               <w:rPr>
                 <w:sz w:val="20"/>
               </w:rPr>
-              <w:t>Coincide con EXPOSE y con el HEALTHCHECK del Dockerfile, que apunta a ese puerto</w:t>
+              <w:t>Coincide con EXPOSE y con el HEALTHCHECK del Dockerfile</w:t>
+            </w:r>
+          </w:p>
+        </w:tc>
+      </w:tr>
+      <w:tr>
+        <w:tc>
+          <w:tcPr>
+            <w:tcW w:type="dxa" w:w="2736"/>
+          </w:tcPr>
+          <w:p>
+            <w:pPr>
+              <w:spacing w:after="40"/>
+            </w:pPr>
+            <w:r/>
+            <w:r>
+              <w:rPr>
+                <w:sz w:val="20"/>
+              </w:rPr>
+              <w:t>RAILWAY_DOCKERFILE_PATH</w:t>
+            </w:r>
+          </w:p>
+        </w:tc>
+        <w:tc>
+          <w:tcPr>
+            <w:tcW w:type="dxa" w:w="2736"/>
+          </w:tcPr>
+          <w:p>
+            <w:pPr>
+              <w:spacing w:after="40"/>
+            </w:pPr>
+            <w:r/>
+            <w:r>
+              <w:rPr>
+                <w:sz w:val="20"/>
+              </w:rPr>
+              <w:t>Dockerfile.backend</w:t>
+            </w:r>
+          </w:p>
+        </w:tc>
+        <w:tc>
+          <w:tcPr>
+            <w:tcW w:type="dxa" w:w="3888"/>
+          </w:tcPr>
+          <w:p>
+            <w:pPr>
+              <w:spacing w:after="40"/>
+            </w:pPr>
+            <w:r/>
+            <w:r>
+              <w:rPr>
+                <w:sz w:val="20"/>
+              </w:rPr>
+              <w:t>Le indica a Railway qué imagen construir (ver el hallazgo más abajo)</w:t>
             </w:r>
           </w:p>
         </w:tc>
@@ -1614,7 +1640,7 @@
           <w:color w:val="595959"/>
           <w:sz w:val="18"/>
         </w:rPr>
-        <w:t>Figura 3. Las tres variables cargadas. Railway las muestra enmascaradas y dibuja la flecha que enlaza el servicio con el plugin de Postgres.</w:t>
+        <w:t>Figura 3. Las variables cargadas y enmascaradas, con la flecha que enlaza el servicio con el plugin de Postgres.</w:t>
       </w:r>
     </w:p>
     <w:p>
@@ -1668,21 +1694,7 @@
           <w:color w:val="595959"/>
           <w:sz w:val="18"/>
         </w:rPr>
-        <w:t>Figura 4. El proyecto con ambos servicios en línea y el dominio público asignado.</w:t>
-      </w:r>
-    </w:p>
-    <w:p>
-      <w:pPr>
-        <w:spacing w:after="120"/>
-      </w:pPr>
-      <w:r>
-        <w:rPr>
-          <w:b/>
-        </w:rPr>
-        <w:t xml:space="preserve">Un detalle del dominio: </w:t>
-      </w:r>
-      <w:r>
-        <w:t>al generarlo, Railway detectó por sí solo el puerto 4000 gracias a la variable PORT y al EXPOSE del Dockerfile. Si el puerto no coincidiera, el healthcheck nunca pasaría a verde aunque la aplicación funcionara — es el error más común de la tabla de problemas de la guía.</w:t>
+        <w:t>Figura 4. El proyecto con ambos servicios en línea y el dominio público asignado al puerto 4000.</w:t>
       </w:r>
     </w:p>
     <w:p>
@@ -1699,6 +1711,29 @@
         <w:ind w:left="216"/>
         <w:shd w:val="clear" w:color="auto" w:fill="F2F2F2"/>
       </w:pPr>
+      <w:r>
+        <w:rPr>
+          <w:rFonts w:ascii="Consolas" w:hAnsi="Consolas" w:eastAsia="Consolas"/>
+          <w:sz w:val="17"/>
+        </w:rPr>
+        <w:t>env:</w:t>
+        <w:br/>
+      </w:r>
+      <w:r>
+        <w:rPr>
+          <w:rFonts w:ascii="Consolas" w:hAnsi="Consolas" w:eastAsia="Consolas"/>
+          <w:sz w:val="17"/>
+        </w:rPr>
+        <w:t xml:space="preserve">  SERVICIO_RAILWAY: fullstack-lab-1-1ci-cd</w:t>
+        <w:br/>
+      </w:r>
+      <w:r>
+        <w:rPr>
+          <w:rFonts w:ascii="Consolas" w:hAnsi="Consolas" w:eastAsia="Consolas"/>
+          <w:sz w:val="17"/>
+        </w:rPr>
+        <w:br/>
+      </w:r>
       <w:r>
         <w:rPr>
           <w:rFonts w:ascii="Consolas" w:hAnsi="Consolas" w:eastAsia="Consolas"/>
@@ -1784,7 +1819,7 @@
           <w:rFonts w:ascii="Consolas" w:hAnsi="Consolas" w:eastAsia="Consolas"/>
           <w:sz w:val="17"/>
         </w:rPr>
-        <w:t xml:space="preserve">        run: railway up --service backend --environment staging --ci</w:t>
+        <w:t xml:space="preserve">        run: railway up --service "$SERVICIO_RAILWAY" --ci</w:t>
         <w:br/>
       </w:r>
       <w:r>
@@ -1800,20 +1835,15 @@
           <w:rFonts w:ascii="Consolas" w:hAnsi="Consolas" w:eastAsia="Consolas"/>
           <w:sz w:val="17"/>
         </w:rPr>
-        <w:t xml:space="preserve">          RAILWAY_TOKEN: ${{ secrets.RAILWAY_TOKEN }}</w:t>
+        <w:t xml:space="preserve">          # Token de proyecto: Railway lo ata a un solo ambiente (staging)</w:t>
+        <w:br/>
       </w:r>
-    </w:p>
-    <w:p>
-      <w:pPr>
-        <w:spacing w:after="60"/>
-      </w:pPr>
       <w:r>
         <w:rPr>
-          <w:b/>
-          <w:i w:val="0"/>
-          <w:sz w:val="22"/>
+          <w:rFonts w:ascii="Consolas" w:hAnsi="Consolas" w:eastAsia="Consolas"/>
+          <w:sz w:val="17"/>
         </w:rPr>
-        <w:t>Los dos guardianes, y qué impide cada uno:</w:t>
+        <w:t xml:space="preserve">          RAILWAY_TOKEN: ${{ secrets.RAILWAY_TOKEN }}</w:t>
       </w:r>
     </w:p>
     <w:tbl>
@@ -1844,7 +1874,7 @@
                 <w:color w:val="FFFFFF"/>
                 <w:sz w:val="20"/>
               </w:rPr>
-              <w:t>Mecanismo</w:t>
+              <w:t>Guardián</w:t>
             </w:r>
           </w:p>
         </w:tc>
@@ -1952,33 +1982,7 @@
         <w:pStyle w:val="Heading2"/>
       </w:pPr>
       <w:r>
-        <w:t>La prueba de que los guardianes funcionan</w:t>
-      </w:r>
-    </w:p>
-    <w:p>
-      <w:pPr>
-        <w:spacing w:after="120"/>
-      </w:pPr>
-      <w:r>
-        <w:rPr>
-          <w:b w:val="0"/>
-          <w:i w:val="0"/>
-          <w:sz w:val="22"/>
-        </w:rPr>
-        <w:t>Se comprobó con dos ejecuciones del mismo workflow sobre el mismo código, cambiando solo el evento que lo dispara.</w:t>
-      </w:r>
-    </w:p>
-    <w:p>
-      <w:pPr>
-        <w:spacing w:after="60"/>
-      </w:pPr>
-      <w:r>
-        <w:rPr>
-          <w:b/>
-          <w:i w:val="0"/>
-          <w:sz w:val="22"/>
-        </w:rPr>
-        <w:t>Primera: Pull Request abierto (run #15).</w:t>
+        <w:t>La prueba de los guardianes</w:t>
       </w:r>
     </w:p>
     <w:p>
@@ -2032,7 +2036,7 @@
           <w:color w:val="595959"/>
           <w:sz w:val="18"/>
         </w:rPr>
-        <w:t>Figura 5. Los cuatro controles en verde y AMBOS jobs de despliegue omitidos (en gris): es un Pull Request, no un push a main.</w:t>
+        <w:t>Figura 5. En un Pull Request, los cuatro controles corren y ambos despliegues se omiten.</w:t>
       </w:r>
     </w:p>
     <w:p>
@@ -2086,20 +2090,7 @@
           <w:color w:val="595959"/>
           <w:sz w:val="18"/>
         </w:rPr>
-        <w:t>Figura 6. El Pull Request #10 integrado a main en el commit 4bd5b86, con 6 checks.</w:t>
-      </w:r>
-    </w:p>
-    <w:p>
-      <w:pPr>
-        <w:spacing w:after="60"/>
-      </w:pPr>
-      <w:r>
-        <w:rPr>
-          <w:b/>
-          <w:i w:val="0"/>
-          <w:sz w:val="22"/>
-        </w:rPr>
-        <w:t>Segunda: push a main tras el merge (run #16).</w:t>
+        <w:t>Figura 6. El Pull Request #10 integrado a main.</w:t>
       </w:r>
     </w:p>
     <w:p>
@@ -2153,7 +2144,86 @@
           <w:color w:val="595959"/>
           <w:sz w:val="18"/>
         </w:rPr>
-        <w:t>Figura 7. Ahora «Deploy a Staging» sí se ejecuta (4 s) y «Deploy a Producción (manual)» sigue omitido (0 s). Exactamente el comportamiento buscado.</w:t>
+        <w:t>Figura 7. Tras el merge, «Deploy a Staging» se ejecuta y «Deploy a Producción» sigue omitido.</w:t>
+      </w:r>
+    </w:p>
+    <w:p>
+      <w:pPr>
+        <w:pStyle w:val="Heading2"/>
+      </w:pPr>
+      <w:r>
+        <w:t>El token: por qué hicieron falta dos</w:t>
+      </w:r>
+    </w:p>
+    <w:p>
+      <w:pPr>
+        <w:spacing w:after="120"/>
+      </w:pPr>
+      <w:r>
+        <w:rPr>
+          <w:b w:val="0"/>
+          <w:i w:val="0"/>
+          <w:sz w:val="22"/>
+        </w:rPr>
+        <w:t>Railway distingue dos tipos de token. El que se generó primero, desde Account Settings, era de workspace y Railway lo rechazó de las dos maneras posibles:</w:t>
+      </w:r>
+    </w:p>
+    <w:p>
+      <w:pPr>
+        <w:spacing w:before="120" w:after="200" w:line="240" w:lineRule="auto"/>
+        <w:ind w:left="216"/>
+        <w:shd w:val="clear" w:color="auto" w:fill="F2F2F2"/>
+      </w:pPr>
+      <w:r>
+        <w:rPr>
+          <w:rFonts w:ascii="Consolas" w:hAnsi="Consolas" w:eastAsia="Consolas"/>
+          <w:sz w:val="17"/>
+        </w:rPr>
+        <w:t># Como RAILWAY_TOKEN</w:t>
+        <w:br/>
+      </w:r>
+      <w:r>
+        <w:rPr>
+          <w:rFonts w:ascii="Consolas" w:hAnsi="Consolas" w:eastAsia="Consolas"/>
+          <w:sz w:val="17"/>
+        </w:rPr>
+        <w:t>Invalid RAILWAY_TOKEN. Please check that it is valid and has access to the resource</w:t>
+        <w:br/>
+      </w:r>
+      <w:r>
+        <w:rPr>
+          <w:rFonts w:ascii="Consolas" w:hAnsi="Consolas" w:eastAsia="Consolas"/>
+          <w:sz w:val="17"/>
+        </w:rPr>
+        <w:br/>
+      </w:r>
+      <w:r>
+        <w:rPr>
+          <w:rFonts w:ascii="Consolas" w:hAnsi="Consolas" w:eastAsia="Consolas"/>
+          <w:sz w:val="17"/>
+        </w:rPr>
+        <w:t># Como RAILWAY_API_TOKEN, enlazando antes el proyecto</w:t>
+        <w:br/>
+      </w:r>
+      <w:r>
+        <w:rPr>
+          <w:rFonts w:ascii="Consolas" w:hAnsi="Consolas" w:eastAsia="Consolas"/>
+          <w:sz w:val="17"/>
+        </w:rPr>
+        <w:t>Unauthorized. Please check that your RAILWAY_API_TOKEN is valid and has access to the resource</w:t>
+      </w:r>
+    </w:p>
+    <w:p>
+      <w:pPr>
+        <w:spacing w:after="120"/>
+      </w:pPr>
+      <w:r>
+        <w:rPr>
+          <w:b w:val="0"/>
+          <w:i w:val="0"/>
+          <w:sz w:val="22"/>
+        </w:rPr>
+        <w:t>Para railway up desde un pipeline se usan tokens de proyecto, que Railway ata a un solo ambiente. Se crearon dos desde Project Settings → Tokens y se guardaron como Secrets:</w:t>
       </w:r>
     </w:p>
     <w:tbl>
@@ -2164,14 +2234,13 @@
         <w:tblLook w:firstColumn="1" w:firstRow="1" w:lastColumn="0" w:lastRow="0" w:noHBand="0" w:noVBand="1" w:val="04A0"/>
       </w:tblPr>
       <w:tblGrid>
-        <w:gridCol w:w="3120"/>
-        <w:gridCol w:w="3120"/>
-        <w:gridCol w:w="3120"/>
+        <w:gridCol w:w="4680"/>
+        <w:gridCol w:w="4680"/>
       </w:tblGrid>
       <w:tr>
         <w:tc>
           <w:tcPr>
-            <w:tcW w:type="dxa" w:w="3744"/>
+            <w:tcW w:type="dxa" w:w="4320"/>
             <w:shd w:val="clear" w:color="auto" w:fill="1F4E79"/>
           </w:tcPr>
           <w:p>
@@ -2185,13 +2254,13 @@
                 <w:color w:val="FFFFFF"/>
                 <w:sz w:val="20"/>
               </w:rPr>
-              <w:t>Evento</w:t>
+              <w:t>Secret de GitHub</w:t>
             </w:r>
           </w:p>
         </w:tc>
         <w:tc>
           <w:tcPr>
-            <w:tcW w:type="dxa" w:w="2880"/>
+            <w:tcW w:type="dxa" w:w="5040"/>
             <w:shd w:val="clear" w:color="auto" w:fill="1F4E79"/>
           </w:tcPr>
           <w:p>
@@ -2205,27 +2274,7 @@
                 <w:color w:val="FFFFFF"/>
                 <w:sz w:val="20"/>
               </w:rPr>
-              <w:t>Deploy a Staging</w:t>
-            </w:r>
-          </w:p>
-        </w:tc>
-        <w:tc>
-          <w:tcPr>
-            <w:tcW w:type="dxa" w:w="2736"/>
-            <w:shd w:val="clear" w:color="auto" w:fill="1F4E79"/>
-          </w:tcPr>
-          <w:p>
-            <w:pPr>
-              <w:spacing w:after="40"/>
-            </w:pPr>
-            <w:r/>
-            <w:r>
-              <w:rPr>
-                <w:b/>
-                <w:color w:val="FFFFFF"/>
-                <w:sz w:val="20"/>
-              </w:rPr>
-              <w:t>Deploy a Producción</w:t>
+              <w:t>Token de proyecto para</w:t>
             </w:r>
           </w:p>
         </w:tc>
@@ -2233,7 +2282,7 @@
       <w:tr>
         <w:tc>
           <w:tcPr>
-            <w:tcW w:type="dxa" w:w="3744"/>
+            <w:tcW w:type="dxa" w:w="4320"/>
           </w:tcPr>
           <w:p>
             <w:pPr>
@@ -2244,13 +2293,13 @@
               <w:rPr>
                 <w:sz w:val="20"/>
               </w:rPr>
-              <w:t>Pull Request abierto (run #15)</w:t>
+              <w:t>RAILWAY_TOKEN</w:t>
             </w:r>
           </w:p>
         </w:tc>
         <w:tc>
           <w:tcPr>
-            <w:tcW w:type="dxa" w:w="2880"/>
+            <w:tcW w:type="dxa" w:w="5040"/>
           </w:tcPr>
           <w:p>
             <w:pPr>
@@ -2261,13 +2310,15 @@
               <w:rPr>
                 <w:sz w:val="20"/>
               </w:rPr>
-              <w:t>Omitido</w:t>
+              <w:t>ambiente staging</w:t>
             </w:r>
           </w:p>
         </w:tc>
+      </w:tr>
+      <w:tr>
         <w:tc>
           <w:tcPr>
-            <w:tcW w:type="dxa" w:w="2736"/>
+            <w:tcW w:type="dxa" w:w="4320"/>
           </w:tcPr>
           <w:p>
             <w:pPr>
@@ -2278,15 +2329,13 @@
               <w:rPr>
                 <w:sz w:val="20"/>
               </w:rPr>
-              <w:t>Omitido</w:t>
+              <w:t>RAILWAY_TOKEN_PRODUCCION</w:t>
             </w:r>
           </w:p>
         </w:tc>
-      </w:tr>
-      <w:tr>
         <w:tc>
           <w:tcPr>
-            <w:tcW w:type="dxa" w:w="3744"/>
+            <w:tcW w:type="dxa" w:w="5040"/>
           </w:tcPr>
           <w:p>
             <w:pPr>
@@ -2297,41 +2346,7 @@
               <w:rPr>
                 <w:sz w:val="20"/>
               </w:rPr>
-              <w:t>Push a main tras el merge (run #16)</w:t>
-            </w:r>
-          </w:p>
-        </w:tc>
-        <w:tc>
-          <w:tcPr>
-            <w:tcW w:type="dxa" w:w="2880"/>
-          </w:tcPr>
-          <w:p>
-            <w:pPr>
-              <w:spacing w:after="40"/>
-            </w:pPr>
-            <w:r/>
-            <w:r>
-              <w:rPr>
-                <w:sz w:val="20"/>
-              </w:rPr>
-              <w:t>Ejecutado</w:t>
-            </w:r>
-          </w:p>
-        </w:tc>
-        <w:tc>
-          <w:tcPr>
-            <w:tcW w:type="dxa" w:w="2736"/>
-          </w:tcPr>
-          <w:p>
-            <w:pPr>
-              <w:spacing w:after="40"/>
-            </w:pPr>
-            <w:r/>
-            <w:r>
-              <w:rPr>
-                <w:sz w:val="20"/>
-              </w:rPr>
-              <w:t>Omitido</w:t>
+              <w:t>ambiente production</w:t>
             </w:r>
           </w:p>
         </w:tc>
@@ -2350,10 +2365,45 @@
         <w:rPr>
           <w:b/>
         </w:rPr>
-        <w:t xml:space="preserve">Qué hizo el job al ejecutarse: </w:t>
+        <w:t xml:space="preserve">Ventaja de seguridad: </w:t>
       </w:r>
       <w:r>
-        <w:t>como el Secret RAILWAY_TOKEN todavía no existe, el job emitió este aviso</w:t>
+        <w:t>con el token de staging es imposible tocar producción. En todos los logs el valor aparece enmascarado como ***.</w:t>
+      </w:r>
+    </w:p>
+    <w:p>
+      <w:pPr>
+        <w:spacing w:after="120"/>
+      </w:pPr>
+      <w:r>
+        <w:rPr>
+          <w:b/>
+        </w:rPr>
+        <w:t xml:space="preserve">Nota: </w:t>
+      </w:r>
+      <w:r>
+        <w:t>el primer token circuló fuera de un canal seguro, así que se revocó. Es el mismo criterio de la Auditoría de Fugas de la Sesión 6: una credencial expuesta se considera comprometida.</w:t>
+      </w:r>
+    </w:p>
+    <w:p>
+      <w:pPr>
+        <w:pStyle w:val="Heading2"/>
+      </w:pPr>
+      <w:r>
+        <w:t>Hallazgo: Railway ya no lee railway.json</w:t>
+      </w:r>
+    </w:p>
+    <w:p>
+      <w:pPr>
+        <w:spacing w:after="120"/>
+      </w:pPr>
+      <w:r>
+        <w:rPr>
+          <w:b w:val="0"/>
+          <w:i w:val="0"/>
+          <w:sz w:val="22"/>
+        </w:rPr>
+        <w:t>Con el token funcionando, el log mostró que Railway construía otra cosa:</w:t>
       </w:r>
     </w:p>
     <w:p>
@@ -2367,7 +2417,7 @@
           <w:rFonts w:ascii="Consolas" w:hAnsi="Consolas" w:eastAsia="Consolas"/>
           <w:sz w:val="17"/>
         </w:rPr>
-        <w:t>Deploy a Staging</w:t>
+        <w:t>Railpack 0.39.0</w:t>
         <w:br/>
       </w:r>
       <w:r>
@@ -2375,7 +2425,23 @@
           <w:rFonts w:ascii="Consolas" w:hAnsi="Consolas" w:eastAsia="Consolas"/>
           <w:sz w:val="17"/>
         </w:rPr>
-        <w:t>RAILWAY_TOKEN no esta configurado: se omite el despliegue a staging.</w:t>
+        <w:t xml:space="preserve">  ↳ Detected Node</w:t>
+        <w:br/>
+      </w:r>
+      <w:r>
+        <w:rPr>
+          <w:rFonts w:ascii="Consolas" w:hAnsi="Consolas" w:eastAsia="Consolas"/>
+          <w:sz w:val="17"/>
+        </w:rPr>
+        <w:t xml:space="preserve">  ↳ Deploying as astro static site</w:t>
+        <w:br/>
+      </w:r>
+      <w:r>
+        <w:rPr>
+          <w:rFonts w:ascii="Consolas" w:hAnsi="Consolas" w:eastAsia="Consolas"/>
+          <w:sz w:val="17"/>
+        </w:rPr>
+        <w:t xml:space="preserve">  ↳ Output directory: dist</w:t>
       </w:r>
     </w:p>
     <w:p>
@@ -2388,7 +2454,153 @@
           <w:i w:val="0"/>
           <w:sz w:val="22"/>
         </w:rPr>
-        <w:t>y terminó en verde sin intentar desplegar. Es una decisión deliberada: si el job fallara por una configuración pendiente, cada merge dejaría main en rojo y el quality gate de la Sesión 4 perdería sentido. En cuanto el Secret exista, los mismos pasos ejecutan railway up sin tocar una línea más.</w:t>
+        <w:t>El panel del servicio explica el motivo: Config as Code quedó obsoleto, y desde el 28 de agosto de 2026 los servicios que nunca lo usaron no pueden activarlo. El railway.json del repositorio se ignora, Railpack detecta Astro y publica el frontend. Eso explica también por qué el primer despliegue de la sesión servía HTML en /health.</w:t>
+      </w:r>
+    </w:p>
+    <w:p>
+      <w:pPr>
+        <w:spacing w:after="120"/>
+      </w:pPr>
+      <w:r>
+        <w:rPr>
+          <w:b w:val="0"/>
+          <w:i w:val="0"/>
+          <w:sz w:val="22"/>
+        </w:rPr>
+        <w:t>La solución es configurar el servicio directamente en el panel, en cada ambiente:</w:t>
+      </w:r>
+    </w:p>
+    <w:p>
+      <w:pPr>
+        <w:spacing w:before="160" w:after="40"/>
+        <w:jc w:val="center"/>
+      </w:pPr>
+      <w:r>
+        <w:drawing>
+          <wp:inline xmlns:a="http://schemas.openxmlformats.org/drawingml/2006/main" xmlns:pic="http://schemas.openxmlformats.org/drawingml/2006/picture">
+            <wp:extent cx="5577840" cy="2485549"/>
+            <wp:docPr id="8" name="Picture 8"/>
+            <wp:cNvGraphicFramePr>
+              <a:graphicFrameLocks noChangeAspect="1"/>
+            </wp:cNvGraphicFramePr>
+            <a:graphic>
+              <a:graphicData uri="http://schemas.openxmlformats.org/drawingml/2006/picture">
+                <pic:pic>
+                  <pic:nvPicPr>
+                    <pic:cNvPr id="0" name="09-configuracion-servicio-produccion.jpg"/>
+                    <pic:cNvPicPr/>
+                  </pic:nvPicPr>
+                  <pic:blipFill>
+                    <a:blip r:embed="rId16"/>
+                    <a:stretch>
+                      <a:fillRect/>
+                    </a:stretch>
+                  </pic:blipFill>
+                  <pic:spPr>
+                    <a:xfrm>
+                      <a:off x="0" y="0"/>
+                      <a:ext cx="5577840" cy="2485549"/>
+                    </a:xfrm>
+                    <a:prstGeom prst="rect"/>
+                  </pic:spPr>
+                </pic:pic>
+              </a:graphicData>
+            </a:graphic>
+          </wp:inline>
+        </w:drawing>
+      </w:r>
+    </w:p>
+    <w:p>
+      <w:pPr>
+        <w:spacing w:after="280"/>
+        <w:jc w:val="center"/>
+      </w:pPr>
+      <w:r>
+        <w:rPr>
+          <w:i/>
+          <w:color w:val="595959"/>
+          <w:sz w:val="18"/>
+        </w:rPr>
+        <w:t>Figura 8. Los dos cambios aplicados al servicio: Healthcheck Path /health y la variable RAILWAY_DOCKERFILE_PATH.</w:t>
+      </w:r>
+    </w:p>
+    <w:p>
+      <w:pPr>
+        <w:pStyle w:val="Heading2"/>
+      </w:pPr>
+      <w:r>
+        <w:t>El primer despliegue real a staging</w:t>
+      </w:r>
+    </w:p>
+    <w:p>
+      <w:pPr>
+        <w:spacing w:after="120"/>
+      </w:pPr>
+      <w:r>
+        <w:rPr>
+          <w:b w:val="0"/>
+          <w:i w:val="0"/>
+          <w:sz w:val="22"/>
+        </w:rPr>
+        <w:t>Con todo corregido, el merge del Pull Request #14 disparó el pipeline completo, que terminó en verde en 2 min 53 s. La URL pública de staging responde con el backend real y su base de datos:</w:t>
+      </w:r>
+    </w:p>
+    <w:p>
+      <w:pPr>
+        <w:spacing w:before="120" w:after="200" w:line="240" w:lineRule="auto"/>
+        <w:ind w:left="216"/>
+        <w:shd w:val="clear" w:color="auto" w:fill="F2F2F2"/>
+      </w:pPr>
+      <w:r>
+        <w:rPr>
+          <w:rFonts w:ascii="Consolas" w:hAnsi="Consolas" w:eastAsia="Consolas"/>
+          <w:sz w:val="17"/>
+        </w:rPr>
+        <w:t>$ curl https://fullstack-lab-1-1ci-cd-staging.up.railway.app/health</w:t>
+        <w:br/>
+      </w:r>
+      <w:r>
+        <w:rPr>
+          <w:rFonts w:ascii="Consolas" w:hAnsi="Consolas" w:eastAsia="Consolas"/>
+          <w:sz w:val="17"/>
+        </w:rPr>
+        <w:t>{"estado":"ok","status":"ok","almacen":"postgres"}</w:t>
+        <w:br/>
+      </w:r>
+      <w:r>
+        <w:rPr>
+          <w:rFonts w:ascii="Consolas" w:hAnsi="Consolas" w:eastAsia="Consolas"/>
+          <w:sz w:val="17"/>
+        </w:rPr>
+        <w:br/>
+      </w:r>
+      <w:r>
+        <w:rPr>
+          <w:rFonts w:ascii="Consolas" w:hAnsi="Consolas" w:eastAsia="Consolas"/>
+          <w:sz w:val="17"/>
+        </w:rPr>
+        <w:t>$ curl -X POST .../tareas -d '{"titulo":"Creada en staging desde el pipeline"}'</w:t>
+        <w:br/>
+      </w:r>
+      <w:r>
+        <w:rPr>
+          <w:rFonts w:ascii="Consolas" w:hAnsi="Consolas" w:eastAsia="Consolas"/>
+          <w:sz w:val="17"/>
+        </w:rPr>
+        <w:t>{"id":1,"titulo":"Creada en staging desde el pipeline","completada":false}</w:t>
+      </w:r>
+    </w:p>
+    <w:p>
+      <w:pPr>
+        <w:spacing w:after="120"/>
+      </w:pPr>
+      <w:r>
+        <w:rPr>
+          <w:b w:val="0"/>
+          <w:i w:val="0"/>
+          <w:sz w:val="22"/>
+        </w:rPr>
+        <w:t>El id 1 confirma que las migraciones corrieron al arrancar: la tabla se creó en la base de staging, que estaba vacía.</w:t>
       </w:r>
     </w:p>
     <w:p>
@@ -2436,6 +2648,26 @@
         <w:rPr>
           <w:sz w:val="22"/>
         </w:rPr>
+        <w:t>El token de Railway está guardado como Secret en GitHub, nunca en el código.</w:t>
+      </w:r>
+    </w:p>
+    <w:p>
+      <w:pPr>
+        <w:spacing w:after="60"/>
+        <w:ind w:left="288"/>
+      </w:pPr>
+      <w:r>
+        <w:rPr>
+          <w:b/>
+          <w:color w:val="1E7B34"/>
+          <w:sz w:val="24"/>
+        </w:rPr>
+        <w:t xml:space="preserve">☑  </w:t>
+      </w:r>
+      <w:r>
+        <w:rPr>
+          <w:sz w:val="22"/>
+        </w:rPr>
         <w:t>El job deploy-staging se dispara solo tras un merge a main, y solo si todo lo anterior pasó.</w:t>
       </w:r>
     </w:p>
@@ -2456,21 +2688,7 @@
         <w:rPr>
           <w:sz w:val="22"/>
         </w:rPr>
-        <w:t>La aplicación desplegada responde en su URL pública.</w:t>
-      </w:r>
-    </w:p>
-    <w:p>
-      <w:pPr>
-        <w:spacing w:after="120"/>
-      </w:pPr>
-      <w:r>
-        <w:rPr>
-          <w:b/>
-        </w:rPr>
-        <w:t xml:space="preserve">Pendiente de este laboratorio: </w:t>
-      </w:r>
-      <w:r>
-        <w:t>el token de Railway guardado como Secret, y con él el despliegue efectivo desde el pipeline.</w:t>
+        <w:t>La aplicación desplegada responde correctamente en su URL pública.</w:t>
       </w:r>
     </w:p>
     <w:p>
@@ -2505,6 +2723,75 @@
         <w:pStyle w:val="Heading2"/>
       </w:pPr>
       <w:r>
+        <w:t>Dos ambientes, dos bases de datos</w:t>
+      </w:r>
+    </w:p>
+    <w:p>
+      <w:pPr>
+        <w:spacing w:after="120"/>
+      </w:pPr>
+      <w:r>
+        <w:rPr>
+          <w:b w:val="0"/>
+          <w:i w:val="0"/>
+          <w:sz w:val="22"/>
+        </w:rPr>
+        <w:t>Railway llama production al primer ambiente del proyecto. Se creó staging duplicándolo: Railway copia servicios, variables y configuración, pero cada ambiente recibe su propio plugin de PostgreSQL con su propio volumen.</w:t>
+      </w:r>
+    </w:p>
+    <w:p>
+      <w:pPr>
+        <w:spacing w:after="120"/>
+      </w:pPr>
+      <w:r>
+        <w:rPr>
+          <w:b w:val="0"/>
+          <w:i w:val="0"/>
+          <w:sz w:val="22"/>
+        </w:rPr>
+        <w:t>La separación se comprobó con datos: la tarea creada en staging no existe en producción.</w:t>
+      </w:r>
+    </w:p>
+    <w:p>
+      <w:pPr>
+        <w:spacing w:before="120" w:after="200" w:line="240" w:lineRule="auto"/>
+        <w:ind w:left="216"/>
+        <w:shd w:val="clear" w:color="auto" w:fill="F2F2F2"/>
+      </w:pPr>
+      <w:r>
+        <w:rPr>
+          <w:rFonts w:ascii="Consolas" w:hAnsi="Consolas" w:eastAsia="Consolas"/>
+          <w:sz w:val="17"/>
+        </w:rPr>
+        <w:t>staging      1 tareas: ['Creada en staging desde el pipeline']</w:t>
+        <w:br/>
+      </w:r>
+      <w:r>
+        <w:rPr>
+          <w:rFonts w:ascii="Consolas" w:hAnsi="Consolas" w:eastAsia="Consolas"/>
+          <w:sz w:val="17"/>
+        </w:rPr>
+        <w:t>production   0 tareas: []</w:t>
+      </w:r>
+    </w:p>
+    <w:p>
+      <w:pPr>
+        <w:spacing w:after="120"/>
+      </w:pPr>
+      <w:r>
+        <w:rPr>
+          <w:b w:val="0"/>
+          <w:i w:val="0"/>
+          <w:sz w:val="22"/>
+        </w:rPr>
+        <w:t>Al duplicar el ambiente, JWT_SECRET había quedado con el mismo valor en los dos. Se reemplazó en staging por ${{secret(48)}}, una función de Railway que genera el valor en el servidor. Los dos ambientes quedaron con secretos distintos sin que nadie tuviera que escribir ni copiar el valor.</w:t>
+      </w:r>
+    </w:p>
+    <w:p>
+      <w:pPr>
+        <w:pStyle w:val="Heading2"/>
+      </w:pPr>
+      <w:r>
         <w:t>El disparador manual</w:t>
       </w:r>
     </w:p>
@@ -2520,38 +2807,6 @@
           <w:sz w:val="17"/>
         </w:rPr>
         <w:t>on:</w:t>
-        <w:br/>
-      </w:r>
-      <w:r>
-        <w:rPr>
-          <w:rFonts w:ascii="Consolas" w:hAnsi="Consolas" w:eastAsia="Consolas"/>
-          <w:sz w:val="17"/>
-        </w:rPr>
-        <w:t xml:space="preserve">  push:</w:t>
-        <w:br/>
-      </w:r>
-      <w:r>
-        <w:rPr>
-          <w:rFonts w:ascii="Consolas" w:hAnsi="Consolas" w:eastAsia="Consolas"/>
-          <w:sz w:val="17"/>
-        </w:rPr>
-        <w:t xml:space="preserve">    branches: [main]</w:t>
-        <w:br/>
-      </w:r>
-      <w:r>
-        <w:rPr>
-          <w:rFonts w:ascii="Consolas" w:hAnsi="Consolas" w:eastAsia="Consolas"/>
-          <w:sz w:val="17"/>
-        </w:rPr>
-        <w:t xml:space="preserve">  pull_request:</w:t>
-        <w:br/>
-      </w:r>
-      <w:r>
-        <w:rPr>
-          <w:rFonts w:ascii="Consolas" w:hAnsi="Consolas" w:eastAsia="Consolas"/>
-          <w:sz w:val="17"/>
-        </w:rPr>
-        <w:t xml:space="preserve">    branches: [main]</w:t>
         <w:br/>
       </w:r>
       <w:r>
@@ -2592,20 +2847,6 @@
           <w:sz w:val="17"/>
         </w:rPr>
         <w:t xml:space="preserve">        required: true</w:t>
-      </w:r>
-    </w:p>
-    <w:p>
-      <w:pPr>
-        <w:spacing w:before="120" w:after="200" w:line="240" w:lineRule="auto"/>
-        <w:ind w:left="216"/>
-        <w:shd w:val="clear" w:color="auto" w:fill="F2F2F2"/>
-      </w:pPr>
-      <w:r>
-        <w:rPr>
-          <w:rFonts w:ascii="Consolas" w:hAnsi="Consolas" w:eastAsia="Consolas"/>
-          <w:sz w:val="17"/>
-        </w:rPr>
-        <w:t xml:space="preserve">  deploy-produccion:</w:t>
         <w:br/>
       </w:r>
       <w:r>
@@ -2613,7 +2854,14 @@
           <w:rFonts w:ascii="Consolas" w:hAnsi="Consolas" w:eastAsia="Consolas"/>
           <w:sz w:val="17"/>
         </w:rPr>
-        <w:t xml:space="preserve">    name: Deploy a Producción (manual)</w:t>
+        <w:br/>
+      </w:r>
+      <w:r>
+        <w:rPr>
+          <w:rFonts w:ascii="Consolas" w:hAnsi="Consolas" w:eastAsia="Consolas"/>
+          <w:sz w:val="17"/>
+        </w:rPr>
+        <w:t xml:space="preserve">  deploy-produccion:</w:t>
         <w:br/>
       </w:r>
       <w:r>
@@ -2637,7 +2885,7 @@
           <w:rFonts w:ascii="Consolas" w:hAnsi="Consolas" w:eastAsia="Consolas"/>
           <w:sz w:val="17"/>
         </w:rPr>
-        <w:t xml:space="preserve">    runs-on: ubuntu-latest</w:t>
+        <w:t xml:space="preserve">    ...</w:t>
         <w:br/>
       </w:r>
       <w:r>
@@ -2645,39 +2893,7 @@
           <w:rFonts w:ascii="Consolas" w:hAnsi="Consolas" w:eastAsia="Consolas"/>
           <w:sz w:val="17"/>
         </w:rPr>
-        <w:t xml:space="preserve">    steps:</w:t>
-        <w:br/>
-      </w:r>
-      <w:r>
-        <w:rPr>
-          <w:rFonts w:ascii="Consolas" w:hAnsi="Consolas" w:eastAsia="Consolas"/>
-          <w:sz w:val="17"/>
-        </w:rPr>
-        <w:t xml:space="preserve">      - uses: actions/checkout@v4</w:t>
-        <w:br/>
-      </w:r>
-      <w:r>
-        <w:rPr>
-          <w:rFonts w:ascii="Consolas" w:hAnsi="Consolas" w:eastAsia="Consolas"/>
-          <w:sz w:val="17"/>
-        </w:rPr>
-        <w:t xml:space="preserve">      - run: npm install -g @railway/cli</w:t>
-        <w:br/>
-      </w:r>
-      <w:r>
-        <w:rPr>
-          <w:rFonts w:ascii="Consolas" w:hAnsi="Consolas" w:eastAsia="Consolas"/>
-          <w:sz w:val="17"/>
-        </w:rPr>
-        <w:t xml:space="preserve">      - name: Desplegar a Railway (produccion)</w:t>
-        <w:br/>
-      </w:r>
-      <w:r>
-        <w:rPr>
-          <w:rFonts w:ascii="Consolas" w:hAnsi="Consolas" w:eastAsia="Consolas"/>
-          <w:sz w:val="17"/>
-        </w:rPr>
-        <w:t xml:space="preserve">        run: railway up --service backend --environment production --ci</w:t>
+        <w:t xml:space="preserve">        run: railway up --service "$SERVICIO_RAILWAY" --ci</w:t>
         <w:br/>
       </w:r>
       <w:r>
@@ -2693,21 +2909,7 @@
           <w:rFonts w:ascii="Consolas" w:hAnsi="Consolas" w:eastAsia="Consolas"/>
           <w:sz w:val="17"/>
         </w:rPr>
-        <w:t xml:space="preserve">          RAILWAY_TOKEN: ${{ secrets.RAILWAY_TOKEN }}</w:t>
-      </w:r>
-    </w:p>
-    <w:p>
-      <w:pPr>
-        <w:spacing w:after="120"/>
-      </w:pPr>
-      <w:r>
-        <w:rPr>
-          <w:b/>
-        </w:rPr>
-        <w:t xml:space="preserve">Por qué exigir escribir DEPLOY: </w:t>
-      </w:r>
-      <w:r>
-        <w:t>es una fricción intencional. La condición tiene dos partes que deben cumplirse a la vez — que el workflow se haya lanzado a mano y que el texto sea exactamente DEPLOY — de modo que ni un push, ni un Pull Request, ni un clic apurado en «Run workflow» con el campo vacío alcanzan para publicar en producción.</w:t>
+        <w:t xml:space="preserve">          RAILWAY_TOKEN: ${{ secrets.RAILWAY_TOKEN_PRODUCCION }}</w:t>
       </w:r>
     </w:p>
     <w:p>
@@ -2715,7 +2917,61 @@
         <w:pStyle w:val="Heading2"/>
       </w:pPr>
       <w:r>
-        <w:t>Verificación</w:t>
+        <w:t>Despliegue manual a producción</w:t>
+      </w:r>
+    </w:p>
+    <w:p>
+      <w:pPr>
+        <w:spacing w:before="160" w:after="40"/>
+        <w:jc w:val="center"/>
+      </w:pPr>
+      <w:r>
+        <w:drawing>
+          <wp:inline xmlns:a="http://schemas.openxmlformats.org/drawingml/2006/main" xmlns:pic="http://schemas.openxmlformats.org/drawingml/2006/picture">
+            <wp:extent cx="5577840" cy="2481365"/>
+            <wp:docPr id="9" name="Picture 9"/>
+            <wp:cNvGraphicFramePr>
+              <a:graphicFrameLocks noChangeAspect="1"/>
+            </wp:cNvGraphicFramePr>
+            <a:graphic>
+              <a:graphicData uri="http://schemas.openxmlformats.org/drawingml/2006/picture">
+                <pic:pic>
+                  <pic:nvPicPr>
+                    <pic:cNvPr id="0" name="10-run-workflow-deploy.jpg"/>
+                    <pic:cNvPicPr/>
+                  </pic:nvPicPr>
+                  <pic:blipFill>
+                    <a:blip r:embed="rId17"/>
+                    <a:stretch>
+                      <a:fillRect/>
+                    </a:stretch>
+                  </pic:blipFill>
+                  <pic:spPr>
+                    <a:xfrm>
+                      <a:off x="0" y="0"/>
+                      <a:ext cx="5577840" cy="2481365"/>
+                    </a:xfrm>
+                    <a:prstGeom prst="rect"/>
+                  </pic:spPr>
+                </pic:pic>
+              </a:graphicData>
+            </a:graphic>
+          </wp:inline>
+        </w:drawing>
+      </w:r>
+    </w:p>
+    <w:p>
+      <w:pPr>
+        <w:spacing w:after="280"/>
+        <w:jc w:val="center"/>
+      </w:pPr>
+      <w:r>
+        <w:rPr>
+          <w:i/>
+          <w:color w:val="595959"/>
+          <w:sz w:val="18"/>
+        </w:rPr>
+        <w:t>Figura 9. Actions → CI → Run workflow, con DEPLOY escrito a mano en el campo de confirmación.</w:t>
       </w:r>
     </w:p>
     <w:p>
@@ -2728,7 +2984,59 @@
           <w:i w:val="0"/>
           <w:sz w:val="22"/>
         </w:rPr>
-        <w:t>La Figura 7 del Laboratorio 1 ya lo demuestra: en el push a main que sí desplegó a staging, el job de producción aparece omitido con 0 segundos. Un push normal nunca llega a producción, que era justamente el checkpoint de este laboratorio.</w:t>
+        <w:t>El run #25 se ejecutó con Deploy a Staging omitido y Deploy a Producción en marcha. El log del job termina así:</w:t>
+      </w:r>
+    </w:p>
+    <w:p>
+      <w:pPr>
+        <w:spacing w:before="120" w:after="200" w:line="240" w:lineRule="auto"/>
+        <w:ind w:left="216"/>
+        <w:shd w:val="clear" w:color="auto" w:fill="F2F2F2"/>
+      </w:pPr>
+      <w:r>
+        <w:rPr>
+          <w:rFonts w:ascii="Consolas" w:hAnsi="Consolas" w:eastAsia="Consolas"/>
+          <w:sz w:val="17"/>
+        </w:rPr>
+        <w:t>Starting Healthcheck</w:t>
+        <w:br/>
+      </w:r>
+      <w:r>
+        <w:rPr>
+          <w:rFonts w:ascii="Consolas" w:hAnsi="Consolas" w:eastAsia="Consolas"/>
+          <w:sz w:val="17"/>
+        </w:rPr>
+        <w:t>[1/1] Healthcheck succeeded!</w:t>
+        <w:br/>
+      </w:r>
+      <w:r>
+        <w:rPr>
+          <w:rFonts w:ascii="Consolas" w:hAnsi="Consolas" w:eastAsia="Consolas"/>
+          <w:sz w:val="17"/>
+        </w:rPr>
+        <w:t>Deploy complete</w:t>
+      </w:r>
+    </w:p>
+    <w:p>
+      <w:pPr>
+        <w:spacing w:before="120" w:after="200" w:line="240" w:lineRule="auto"/>
+        <w:ind w:left="216"/>
+        <w:shd w:val="clear" w:color="auto" w:fill="F2F2F2"/>
+      </w:pPr>
+      <w:r>
+        <w:rPr>
+          <w:rFonts w:ascii="Consolas" w:hAnsi="Consolas" w:eastAsia="Consolas"/>
+          <w:sz w:val="17"/>
+        </w:rPr>
+        <w:t>$ curl https://fullstack-lab-1-1ci-cd-production.up.railway.app/health</w:t>
+        <w:br/>
+      </w:r>
+      <w:r>
+        <w:rPr>
+          <w:rFonts w:ascii="Consolas" w:hAnsi="Consolas" w:eastAsia="Consolas"/>
+          <w:sz w:val="17"/>
+        </w:rPr>
+        <w:t>{"estado":"ok","status":"ok","almacen":"postgres"}</w:t>
       </w:r>
     </w:p>
     <w:p>
@@ -2737,6 +3045,26 @@
       </w:pPr>
       <w:r>
         <w:t>Checkpoint del Laboratorio 2</w:t>
+      </w:r>
+    </w:p>
+    <w:p>
+      <w:pPr>
+        <w:spacing w:after="60"/>
+        <w:ind w:left="288"/>
+      </w:pPr>
+      <w:r>
+        <w:rPr>
+          <w:b/>
+          <w:color w:val="1E7B34"/>
+          <w:sz w:val="24"/>
+        </w:rPr>
+        <w:t xml:space="preserve">☑  </w:t>
+      </w:r>
+      <w:r>
+        <w:rPr>
+          <w:sz w:val="22"/>
+        </w:rPr>
+        <w:t>Staging y producción son ambientes separados en Railway, con sus propias variables y base de datos.</w:t>
       </w:r>
     </w:p>
     <w:p>
@@ -2776,21 +3104,7 @@
         <w:rPr>
           <w:sz w:val="22"/>
         </w:rPr>
-        <w:t>Se confirmó que un push a main nunca dispara el despliegue a producción, solo a staging.</w:t>
-      </w:r>
-    </w:p>
-    <w:p>
-      <w:pPr>
-        <w:spacing w:after="120"/>
-      </w:pPr>
-      <w:r>
-        <w:rPr>
-          <w:b/>
-        </w:rPr>
-        <w:t xml:space="preserve">Pendiente: </w:t>
-      </w:r>
-      <w:r>
-        <w:t>crear el ambiente production en Railway, con su propio plugin de PostgreSQL y sus variables independientes. Sin el token, ejecutar el despliegue manual no tendría efecto observable, así que se documenta el procedimiento en lugar de simularlo.</w:t>
+        <w:t>Un push normal a main nunca dispara el despliegue a producción, solo a staging (Figura 7).</w:t>
       </w:r>
     </w:p>
     <w:p>
@@ -2817,7 +3131,7 @@
           <w:color w:val="595959"/>
           <w:sz w:val="22"/>
         </w:rPr>
-        <w:t>Objetivo: provocar un despliegue defectuoso, diagnosticarlo con logs y healthcheck, y revertirlo con un rollback antes de corregir el problema real.</w:t>
+        <w:t>Objetivo: vivir el ciclo completo de un incidente en staging — provocarlo, diagnosticarlo bajo presión de tiempo y revertirlo — antes de corregir el problema real con calma.</w:t>
       </w:r>
     </w:p>
     <w:p>
@@ -2825,7 +3139,7 @@
         <w:pStyle w:val="Heading2"/>
       </w:pPr>
       <w:r>
-        <w:t>La ruta de salud, que sí quedó lista</w:t>
+        <w:t>Ronda 1 — Provocar el desastre</w:t>
       </w:r>
     </w:p>
     <w:p>
@@ -2838,7 +3152,7 @@
           <w:i w:val="0"/>
           <w:sz w:val="22"/>
         </w:rPr>
-        <w:t>El proyecto ya exponía /salud desde la Sesión 5, usada por el HEALTHCHECK del contenedor. Se agregó /health, que es la ruta que Railway espera por convención, compartiendo el mismo manejador:</w:t>
+        <w:t>Se eligió la opción A de la guía: una variable de entorno con el nombre incorrecto en el arranque del servidor.</w:t>
       </w:r>
     </w:p>
     <w:p>
@@ -2852,7 +3166,7 @@
           <w:rFonts w:ascii="Consolas" w:hAnsi="Consolas" w:eastAsia="Consolas"/>
           <w:sz w:val="17"/>
         </w:rPr>
-        <w:t>function sondaDeSalud(req, res) {</w:t>
+        <w:t>// src/server/index.js</w:t>
         <w:br/>
       </w:r>
       <w:r>
@@ -2860,7 +3174,23 @@
           <w:rFonts w:ascii="Consolas" w:hAnsi="Consolas" w:eastAsia="Consolas"/>
           <w:sz w:val="17"/>
         </w:rPr>
-        <w:t xml:space="preserve">    res.status(200).json({ estado: 'ok', status: 'ok', almacen: repositorio.tipo });</w:t>
+        <w:t>// Validacion de arranque: sin base de datos no tiene sentido levantar la API.</w:t>
+        <w:br/>
+      </w:r>
+      <w:r>
+        <w:rPr>
+          <w:rFonts w:ascii="Consolas" w:hAnsi="Consolas" w:eastAsia="Consolas"/>
+          <w:sz w:val="17"/>
+        </w:rPr>
+        <w:t>if (!process.env.DATABASE_URLL) {</w:t>
+        <w:br/>
+      </w:r>
+      <w:r>
+        <w:rPr>
+          <w:rFonts w:ascii="Consolas" w:hAnsi="Consolas" w:eastAsia="Consolas"/>
+          <w:sz w:val="17"/>
+        </w:rPr>
+        <w:t xml:space="preserve">    throw new Error('DATABASE_URL no esta definida: la API no puede arrancar sin base de datos');</w:t>
         <w:br/>
       </w:r>
       <w:r>
@@ -2869,29 +3199,20 @@
           <w:sz w:val="17"/>
         </w:rPr>
         <w:t>}</w:t>
-        <w:br/>
+      </w:r>
+    </w:p>
+    <w:p>
+      <w:pPr>
+        <w:spacing w:after="120"/>
+      </w:pPr>
+      <w:r>
+        <w:rPr>
+          <w:b/>
+        </w:rPr>
+        <w:t xml:space="preserve">Por qué no la opción B: </w:t>
       </w:r>
       <w:r>
-        <w:rPr>
-          <w:rFonts w:ascii="Consolas" w:hAnsi="Consolas" w:eastAsia="Consolas"/>
-          <w:sz w:val="17"/>
-        </w:rPr>
-        <w:br/>
-      </w:r>
-      <w:r>
-        <w:rPr>
-          <w:rFonts w:ascii="Consolas" w:hAnsi="Consolas" w:eastAsia="Consolas"/>
-          <w:sz w:val="17"/>
-        </w:rPr>
-        <w:t>app.get('/salud', sondaDeSalud);</w:t>
-        <w:br/>
-      </w:r>
-      <w:r>
-        <w:rPr>
-          <w:rFonts w:ascii="Consolas" w:hAnsi="Consolas" w:eastAsia="Consolas"/>
-          <w:sz w:val="17"/>
-        </w:rPr>
-        <w:t>app.get('/health', sondaDeSalud);</w:t>
+        <w:t>un throw suelto antes de app.listen() deja código inalcanzable y ESLint lo frena con la regla no-unreachable. El quality gate lo habría detenido antes de llegar a staging, que es una buena noticia, pero no permitía hacer el simulacro.</w:t>
       </w:r>
     </w:p>
     <w:p>
@@ -2904,569 +3225,7 @@
           <w:i w:val="0"/>
           <w:sz w:val="22"/>
         </w:rPr>
-        <w:t>Verificado sobre la imagen real del backend, no solo en pruebas:</w:t>
-      </w:r>
-    </w:p>
-    <w:p>
-      <w:pPr>
-        <w:spacing w:before="120" w:after="200" w:line="240" w:lineRule="auto"/>
-        <w:ind w:left="216"/>
-        <w:shd w:val="clear" w:color="auto" w:fill="F2F2F2"/>
-      </w:pPr>
-      <w:r>
-        <w:rPr>
-          <w:rFonts w:ascii="Consolas" w:hAnsi="Consolas" w:eastAsia="Consolas"/>
-          <w:sz w:val="17"/>
-        </w:rPr>
-        <w:t>$ docker run -d --name prueba-health -p 4010:4000 -e PORT=4000 mi-backend-s7</w:t>
-        <w:br/>
-      </w:r>
-      <w:r>
-        <w:rPr>
-          <w:rFonts w:ascii="Consolas" w:hAnsi="Consolas" w:eastAsia="Consolas"/>
-          <w:sz w:val="17"/>
-        </w:rPr>
-        <w:br/>
-      </w:r>
-      <w:r>
-        <w:rPr>
-          <w:rFonts w:ascii="Consolas" w:hAnsi="Consolas" w:eastAsia="Consolas"/>
-          <w:sz w:val="17"/>
-        </w:rPr>
-        <w:t>$ curl -s http://localhost:4010/health</w:t>
-        <w:br/>
-      </w:r>
-      <w:r>
-        <w:rPr>
-          <w:rFonts w:ascii="Consolas" w:hAnsi="Consolas" w:eastAsia="Consolas"/>
-          <w:sz w:val="17"/>
-        </w:rPr>
-        <w:t>{"estado":"ok","status":"ok","almacen":"memoria"}</w:t>
-        <w:br/>
-      </w:r>
-      <w:r>
-        <w:rPr>
-          <w:rFonts w:ascii="Consolas" w:hAnsi="Consolas" w:eastAsia="Consolas"/>
-          <w:sz w:val="17"/>
-        </w:rPr>
-        <w:br/>
-      </w:r>
-      <w:r>
-        <w:rPr>
-          <w:rFonts w:ascii="Consolas" w:hAnsi="Consolas" w:eastAsia="Consolas"/>
-          <w:sz w:val="17"/>
-        </w:rPr>
-        <w:t>$ curl -s http://localhost:4010/salud</w:t>
-        <w:br/>
-      </w:r>
-      <w:r>
-        <w:rPr>
-          <w:rFonts w:ascii="Consolas" w:hAnsi="Consolas" w:eastAsia="Consolas"/>
-          <w:sz w:val="17"/>
-        </w:rPr>
-        <w:t>{"estado":"ok","status":"ok","almacen":"memoria"}</w:t>
-      </w:r>
-    </w:p>
-    <w:p>
-      <w:pPr>
-        <w:spacing w:after="120"/>
-      </w:pPr>
-      <w:r>
-        <w:t xml:space="preserve">Y en </w:t>
-      </w:r>
-      <w:r>
-        <w:rPr>
-          <w:rFonts w:ascii="Consolas" w:hAnsi="Consolas" w:eastAsia="Consolas"/>
-          <w:sz w:val="19"/>
-        </w:rPr>
-        <w:t>railway.json</w:t>
-      </w:r>
-      <w:r>
-        <w:t xml:space="preserve"> se declara como healthcheck de la plataforma, junto con el restart automático ante fallo:</w:t>
-      </w:r>
-    </w:p>
-    <w:p>
-      <w:pPr>
-        <w:spacing w:before="120" w:after="200" w:line="240" w:lineRule="auto"/>
-        <w:ind w:left="216"/>
-        <w:shd w:val="clear" w:color="auto" w:fill="F2F2F2"/>
-      </w:pPr>
-      <w:r>
-        <w:rPr>
-          <w:rFonts w:ascii="Consolas" w:hAnsi="Consolas" w:eastAsia="Consolas"/>
-          <w:sz w:val="17"/>
-        </w:rPr>
-        <w:t xml:space="preserve">  "deploy": {</w:t>
-        <w:br/>
-      </w:r>
-      <w:r>
-        <w:rPr>
-          <w:rFonts w:ascii="Consolas" w:hAnsi="Consolas" w:eastAsia="Consolas"/>
-          <w:sz w:val="17"/>
-        </w:rPr>
-        <w:t xml:space="preserve">    "healthcheckPath": "/health",</w:t>
-        <w:br/>
-      </w:r>
-      <w:r>
-        <w:rPr>
-          <w:rFonts w:ascii="Consolas" w:hAnsi="Consolas" w:eastAsia="Consolas"/>
-          <w:sz w:val="17"/>
-        </w:rPr>
-        <w:t xml:space="preserve">    "healthcheckTimeout": 60,</w:t>
-        <w:br/>
-      </w:r>
-      <w:r>
-        <w:rPr>
-          <w:rFonts w:ascii="Consolas" w:hAnsi="Consolas" w:eastAsia="Consolas"/>
-          <w:sz w:val="17"/>
-        </w:rPr>
-        <w:t xml:space="preserve">    "restartPolicyType": "ON_FAILURE",</w:t>
-        <w:br/>
-      </w:r>
-      <w:r>
-        <w:rPr>
-          <w:rFonts w:ascii="Consolas" w:hAnsi="Consolas" w:eastAsia="Consolas"/>
-          <w:sz w:val="17"/>
-        </w:rPr>
-        <w:t xml:space="preserve">    "restartPolicyMaxRetries": 3</w:t>
-        <w:br/>
-      </w:r>
-      <w:r>
-        <w:rPr>
-          <w:rFonts w:ascii="Consolas" w:hAnsi="Consolas" w:eastAsia="Consolas"/>
-          <w:sz w:val="17"/>
-        </w:rPr>
-        <w:t xml:space="preserve">  }</w:t>
-      </w:r>
-    </w:p>
-    <w:p>
-      <w:pPr>
-        <w:pStyle w:val="Heading2"/>
-      </w:pPr>
-      <w:r>
-        <w:t>Las tres rondas: pendientes</w:t>
-      </w:r>
-    </w:p>
-    <w:p>
-      <w:pPr>
-        <w:spacing w:after="120"/>
-      </w:pPr>
-      <w:r>
-        <w:rPr>
-          <w:b w:val="0"/>
-          <w:i w:val="0"/>
-          <w:sz w:val="22"/>
-        </w:rPr>
-        <w:t>Provocar el desastre, diagnosticarlo en los logs de Railway y ejecutar el rollback requieren un despliegue sano previo contra el cual comparar. Ese despliegue depende del token, así que las tres rondas quedan pendientes.</w:t>
-      </w:r>
-    </w:p>
-    <w:tbl>
-      <w:tblPr>
-        <w:tblStyle w:val="TableGrid"/>
-        <w:tblW w:type="auto" w:w="0"/>
-        <w:jc w:val="center"/>
-        <w:tblLook w:firstColumn="1" w:firstRow="1" w:lastColumn="0" w:lastRow="0" w:noHBand="0" w:noVBand="1" w:val="04A0"/>
-      </w:tblPr>
-      <w:tblGrid>
-        <w:gridCol w:w="3120"/>
-        <w:gridCol w:w="3120"/>
-        <w:gridCol w:w="3120"/>
-      </w:tblGrid>
-      <w:tr>
-        <w:tc>
-          <w:tcPr>
-            <w:tcW w:type="dxa" w:w="2592"/>
-            <w:shd w:val="clear" w:color="auto" w:fill="1F4E79"/>
-          </w:tcPr>
-          <w:p>
-            <w:pPr>
-              <w:spacing w:after="40"/>
-            </w:pPr>
-            <w:r/>
-            <w:r>
-              <w:rPr>
-                <w:b/>
-                <w:color w:val="FFFFFF"/>
-                <w:sz w:val="20"/>
-              </w:rPr>
-              <w:t>Ronda</w:t>
-            </w:r>
-          </w:p>
-        </w:tc>
-        <w:tc>
-          <w:tcPr>
-            <w:tcW w:type="dxa" w:w="3888"/>
-            <w:shd w:val="clear" w:color="auto" w:fill="1F4E79"/>
-          </w:tcPr>
-          <w:p>
-            <w:pPr>
-              <w:spacing w:after="40"/>
-            </w:pPr>
-            <w:r/>
-            <w:r>
-              <w:rPr>
-                <w:b/>
-                <w:color w:val="FFFFFF"/>
-                <w:sz w:val="20"/>
-              </w:rPr>
-              <w:t>Qué exige</w:t>
-            </w:r>
-          </w:p>
-        </w:tc>
-        <w:tc>
-          <w:tcPr>
-            <w:tcW w:type="dxa" w:w="2880"/>
-            <w:shd w:val="clear" w:color="auto" w:fill="1F4E79"/>
-          </w:tcPr>
-          <w:p>
-            <w:pPr>
-              <w:spacing w:after="40"/>
-            </w:pPr>
-            <w:r/>
-            <w:r>
-              <w:rPr>
-                <w:b/>
-                <w:color w:val="FFFFFF"/>
-                <w:sz w:val="20"/>
-              </w:rPr>
-              <w:t>Bloqueo</w:t>
-            </w:r>
-          </w:p>
-        </w:tc>
-      </w:tr>
-      <w:tr>
-        <w:tc>
-          <w:tcPr>
-            <w:tcW w:type="dxa" w:w="2592"/>
-          </w:tcPr>
-          <w:p>
-            <w:pPr>
-              <w:spacing w:after="40"/>
-            </w:pPr>
-            <w:r/>
-            <w:r>
-              <w:rPr>
-                <w:sz w:val="20"/>
-              </w:rPr>
-              <w:t>1 — Provocar el desastre</w:t>
-            </w:r>
-          </w:p>
-        </w:tc>
-        <w:tc>
-          <w:tcPr>
-            <w:tcW w:type="dxa" w:w="3888"/>
-          </w:tcPr>
-          <w:p>
-            <w:pPr>
-              <w:spacing w:after="40"/>
-            </w:pPr>
-            <w:r/>
-            <w:r>
-              <w:rPr>
-                <w:sz w:val="20"/>
-              </w:rPr>
-              <w:t>Un merge que despliegue y falle el healthcheck</w:t>
-            </w:r>
-          </w:p>
-        </w:tc>
-        <w:tc>
-          <w:tcPr>
-            <w:tcW w:type="dxa" w:w="2880"/>
-          </w:tcPr>
-          <w:p>
-            <w:pPr>
-              <w:spacing w:after="40"/>
-            </w:pPr>
-            <w:r/>
-            <w:r>
-              <w:rPr>
-                <w:sz w:val="20"/>
-              </w:rPr>
-              <w:t>No hay despliegue automático todavía</w:t>
-            </w:r>
-          </w:p>
-        </w:tc>
-      </w:tr>
-      <w:tr>
-        <w:tc>
-          <w:tcPr>
-            <w:tcW w:type="dxa" w:w="2592"/>
-          </w:tcPr>
-          <w:p>
-            <w:pPr>
-              <w:spacing w:after="40"/>
-            </w:pPr>
-            <w:r/>
-            <w:r>
-              <w:rPr>
-                <w:sz w:val="20"/>
-              </w:rPr>
-              <w:t>2 — Diagnóstico</w:t>
-            </w:r>
-          </w:p>
-        </w:tc>
-        <w:tc>
-          <w:tcPr>
-            <w:tcW w:type="dxa" w:w="3888"/>
-          </w:tcPr>
-          <w:p>
-            <w:pPr>
-              <w:spacing w:after="40"/>
-            </w:pPr>
-            <w:r/>
-            <w:r>
-              <w:rPr>
-                <w:sz w:val="20"/>
-              </w:rPr>
-              <w:t>Leer los logs del despliegue fallido en Railway</w:t>
-            </w:r>
-          </w:p>
-        </w:tc>
-        <w:tc>
-          <w:tcPr>
-            <w:tcW w:type="dxa" w:w="2880"/>
-          </w:tcPr>
-          <w:p>
-            <w:pPr>
-              <w:spacing w:after="40"/>
-            </w:pPr>
-            <w:r/>
-            <w:r>
-              <w:rPr>
-                <w:sz w:val="20"/>
-              </w:rPr>
-              <w:t>No existe ese despliegue fallido</w:t>
-            </w:r>
-          </w:p>
-        </w:tc>
-      </w:tr>
-      <w:tr>
-        <w:tc>
-          <w:tcPr>
-            <w:tcW w:type="dxa" w:w="2592"/>
-          </w:tcPr>
-          <w:p>
-            <w:pPr>
-              <w:spacing w:after="40"/>
-            </w:pPr>
-            <w:r/>
-            <w:r>
-              <w:rPr>
-                <w:sz w:val="20"/>
-              </w:rPr>
-              <w:t>3 — Rollback</w:t>
-            </w:r>
-          </w:p>
-        </w:tc>
-        <w:tc>
-          <w:tcPr>
-            <w:tcW w:type="dxa" w:w="3888"/>
-          </w:tcPr>
-          <w:p>
-            <w:pPr>
-              <w:spacing w:after="40"/>
-            </w:pPr>
-            <w:r/>
-            <w:r>
-              <w:rPr>
-                <w:sz w:val="20"/>
-              </w:rPr>
-              <w:t>Volver al despliegue anterior sano</w:t>
-            </w:r>
-          </w:p>
-        </w:tc>
-        <w:tc>
-          <w:tcPr>
-            <w:tcW w:type="dxa" w:w="2880"/>
-          </w:tcPr>
-          <w:p>
-            <w:pPr>
-              <w:spacing w:after="40"/>
-            </w:pPr>
-            <w:r/>
-            <w:r>
-              <w:rPr>
-                <w:sz w:val="20"/>
-              </w:rPr>
-              <w:t>Solo hay un despliegue en el historial</w:t>
-            </w:r>
-          </w:p>
-        </w:tc>
-      </w:tr>
-    </w:tbl>
-    <w:p>
-      <w:pPr>
-        <w:spacing w:after="40"/>
-      </w:pPr>
-    </w:p>
-    <w:p>
-      <w:r>
-        <w:br w:type="page"/>
-      </w:r>
-    </w:p>
-    <w:p>
-      <w:pPr>
-        <w:pStyle w:val="Heading1"/>
-      </w:pPr>
-      <w:r>
-        <w:t>Hallazgo: Railway no construía el backend</w:t>
-      </w:r>
-    </w:p>
-    <w:p>
-      <w:pPr>
-        <w:spacing w:after="120"/>
-      </w:pPr>
-      <w:r>
-        <w:rPr>
-          <w:b w:val="0"/>
-          <w:i w:val="0"/>
-          <w:sz w:val="22"/>
-        </w:rPr>
-        <w:t>Al abrir la URL pública por primera vez, /health no devolvía JSON sino la página de Astro:</w:t>
-      </w:r>
-    </w:p>
-    <w:p>
-      <w:pPr>
-        <w:spacing w:before="120" w:after="200" w:line="240" w:lineRule="auto"/>
-        <w:ind w:left="216"/>
-        <w:shd w:val="clear" w:color="auto" w:fill="F2F2F2"/>
-      </w:pPr>
-      <w:r>
-        <w:rPr>
-          <w:rFonts w:ascii="Consolas" w:hAnsi="Consolas" w:eastAsia="Consolas"/>
-          <w:sz w:val="17"/>
-        </w:rPr>
-        <w:t>$ curl -s https://fullstack-lab-1-1ci-cd-production.up.railway.app/health</w:t>
-        <w:br/>
-      </w:r>
-      <w:r>
-        <w:rPr>
-          <w:rFonts w:ascii="Consolas" w:hAnsi="Consolas" w:eastAsia="Consolas"/>
-          <w:sz w:val="17"/>
-        </w:rPr>
-        <w:t>&lt;!DOCTYPE html&gt;&lt;html lang="en" …&gt;&lt;title&gt;Astro Basics&lt;/title&gt;…</w:t>
-      </w:r>
-    </w:p>
-    <w:p>
-      <w:pPr>
-        <w:spacing w:after="120"/>
-      </w:pPr>
-      <w:r>
-        <w:rPr>
-          <w:b w:val="0"/>
-          <w:i w:val="0"/>
-          <w:sz w:val="22"/>
-        </w:rPr>
-        <w:t>La causa: Railway busca un archivo llamado exactamente Dockerfile. Los de este proyecto se llaman Dockerfile.backend y Dockerfile.frontend, así que la plataforma no encontró ninguno y recurrió a su detección automática, que construyó el sitio de Astro en lugar de la API.</w:t>
-      </w:r>
-    </w:p>
-    <w:p>
-      <w:pPr>
-        <w:spacing w:after="120"/>
-      </w:pPr>
-      <w:r>
-        <w:t xml:space="preserve">La corrección es </w:t>
-      </w:r>
-      <w:r>
-        <w:rPr>
-          <w:rFonts w:ascii="Consolas" w:hAnsi="Consolas" w:eastAsia="Consolas"/>
-          <w:sz w:val="19"/>
-        </w:rPr>
-        <w:t>railway.json</w:t>
-      </w:r>
-      <w:r>
-        <w:t>, que indica explícitamente qué construir:</w:t>
-      </w:r>
-    </w:p>
-    <w:p>
-      <w:pPr>
-        <w:spacing w:before="120" w:after="200" w:line="240" w:lineRule="auto"/>
-        <w:ind w:left="216"/>
-        <w:shd w:val="clear" w:color="auto" w:fill="F2F2F2"/>
-      </w:pPr>
-      <w:r>
-        <w:rPr>
-          <w:rFonts w:ascii="Consolas" w:hAnsi="Consolas" w:eastAsia="Consolas"/>
-          <w:sz w:val="17"/>
-        </w:rPr>
-        <w:t>{</w:t>
-        <w:br/>
-      </w:r>
-      <w:r>
-        <w:rPr>
-          <w:rFonts w:ascii="Consolas" w:hAnsi="Consolas" w:eastAsia="Consolas"/>
-          <w:sz w:val="17"/>
-        </w:rPr>
-        <w:t xml:space="preserve">  "$schema": "https://railway.app/railway.schema.json",</w:t>
-        <w:br/>
-      </w:r>
-      <w:r>
-        <w:rPr>
-          <w:rFonts w:ascii="Consolas" w:hAnsi="Consolas" w:eastAsia="Consolas"/>
-          <w:sz w:val="17"/>
-        </w:rPr>
-        <w:t xml:space="preserve">  "build": {</w:t>
-        <w:br/>
-      </w:r>
-      <w:r>
-        <w:rPr>
-          <w:rFonts w:ascii="Consolas" w:hAnsi="Consolas" w:eastAsia="Consolas"/>
-          <w:sz w:val="17"/>
-        </w:rPr>
-        <w:t xml:space="preserve">    "builder": "DOCKERFILE",</w:t>
-        <w:br/>
-      </w:r>
-      <w:r>
-        <w:rPr>
-          <w:rFonts w:ascii="Consolas" w:hAnsi="Consolas" w:eastAsia="Consolas"/>
-          <w:sz w:val="17"/>
-        </w:rPr>
-        <w:t xml:space="preserve">    "dockerfilePath": "Dockerfile.backend"</w:t>
-        <w:br/>
-      </w:r>
-      <w:r>
-        <w:rPr>
-          <w:rFonts w:ascii="Consolas" w:hAnsi="Consolas" w:eastAsia="Consolas"/>
-          <w:sz w:val="17"/>
-        </w:rPr>
-        <w:t xml:space="preserve">  },</w:t>
-        <w:br/>
-      </w:r>
-      <w:r>
-        <w:rPr>
-          <w:rFonts w:ascii="Consolas" w:hAnsi="Consolas" w:eastAsia="Consolas"/>
-          <w:sz w:val="17"/>
-        </w:rPr>
-        <w:t xml:space="preserve">  "deploy": { "healthcheckPath": "/health", … }</w:t>
-        <w:br/>
-      </w:r>
-      <w:r>
-        <w:rPr>
-          <w:rFonts w:ascii="Consolas" w:hAnsi="Consolas" w:eastAsia="Consolas"/>
-          <w:sz w:val="17"/>
-        </w:rPr>
-        <w:t>}</w:t>
-      </w:r>
-    </w:p>
-    <w:p>
-      <w:pPr>
-        <w:pStyle w:val="Heading2"/>
-      </w:pPr>
-      <w:r>
-        <w:t>Por qué la URL todavía sirve el frontend</w:t>
-      </w:r>
-    </w:p>
-    <w:p>
-      <w:pPr>
-        <w:spacing w:after="120"/>
-      </w:pPr>
-      <w:r>
-        <w:rPr>
-          <w:b w:val="0"/>
-          <w:i w:val="0"/>
-          <w:sz w:val="22"/>
-        </w:rPr>
-        <w:t>El archivo ya está en main, pero el despliegue activo en Railway es anterior: corresponde al merge del Pull Request #9, de antes de que railway.json existiera.</w:t>
+        <w:t>Como anticipaba la guía, el Pull Request #15 pasó los cuatro controles: ninguna prueba carga index.js y ESLint no puede saber que el nombre de la variable está mal. Tras el merge, el despliegue a staging falló:</w:t>
       </w:r>
     </w:p>
     <w:p>
@@ -3477,8 +3236,8 @@
       <w:r>
         <w:drawing>
           <wp:inline xmlns:a="http://schemas.openxmlformats.org/drawingml/2006/main" xmlns:pic="http://schemas.openxmlformats.org/drawingml/2006/picture">
-            <wp:extent cx="5577840" cy="2643695"/>
-            <wp:docPr id="8" name="Picture 8"/>
+            <wp:extent cx="5577840" cy="2485549"/>
+            <wp:docPr id="10" name="Picture 10"/>
             <wp:cNvGraphicFramePr>
               <a:graphicFrameLocks noChangeAspect="1"/>
             </wp:cNvGraphicFramePr>
@@ -3486,11 +3245,11 @@
               <a:graphicData uri="http://schemas.openxmlformats.org/drawingml/2006/picture">
                 <pic:pic>
                   <pic:nvPicPr>
-                    <pic:cNvPr id="0" name="05-despliegue-activo-railway.jpg"/>
+                    <pic:cNvPr id="0" name="11-staging-healthcheck-fallido.jpg"/>
                     <pic:cNvPicPr/>
                   </pic:nvPicPr>
                   <pic:blipFill>
-                    <a:blip r:embed="rId16"/>
+                    <a:blip r:embed="rId18"/>
                     <a:stretch>
                       <a:fillRect/>
                     </a:stretch>
@@ -3498,7 +3257,7 @@
                   <pic:spPr>
                     <a:xfrm>
                       <a:off x="0" y="0"/>
-                      <a:ext cx="5577840" cy="2643695"/>
+                      <a:ext cx="5577840" cy="2485549"/>
                     </a:xfrm>
                     <a:prstGeom prst="rect"/>
                   </pic:spPr>
@@ -3520,7 +3279,7 @@
           <w:color w:val="595959"/>
           <w:sz w:val="18"/>
         </w:rPr>
-        <w:t>Figura 8. El despliegue ACTIVO sigue siendo el del Pull Request #9. El merge del #10 no generó uno nuevo.</w:t>
+        <w:t>Figura 10. El despliegue de railway up queda en FAILED: pasa Build y Deploy, pero Network › Healthcheck falla tras 4:51. El ACTIVE sigue siendo el despliegue sano.</w:t>
       </w:r>
     </w:p>
     <w:p>
@@ -3533,7 +3292,67 @@
           <w:i w:val="0"/>
           <w:sz w:val="22"/>
         </w:rPr>
-        <w:t>El motivo es que el proyecto se creó pegando la URL pública del repositorio, sin instalar la GitHub App de Railway. Sin esa instalación no hay webhook, y por lo tanto Railway no se entera de los push a main.</w:t>
+        <w:t>Mientras duró el incidente se consultó la URL pública cada 30 segundos:</w:t>
+      </w:r>
+    </w:p>
+    <w:p>
+      <w:pPr>
+        <w:spacing w:before="120" w:after="200" w:line="240" w:lineRule="auto"/>
+        <w:ind w:left="216"/>
+        <w:shd w:val="clear" w:color="auto" w:fill="F2F2F2"/>
+      </w:pPr>
+      <w:r>
+        <w:rPr>
+          <w:rFonts w:ascii="Consolas" w:hAnsi="Consolas" w:eastAsia="Consolas"/>
+          <w:sz w:val="17"/>
+        </w:rPr>
+        <w:t>05:35:03  pipeline=queued        staging/health=200</w:t>
+        <w:br/>
+      </w:r>
+      <w:r>
+        <w:rPr>
+          <w:rFonts w:ascii="Consolas" w:hAnsi="Consolas" w:eastAsia="Consolas"/>
+          <w:sz w:val="17"/>
+        </w:rPr>
+        <w:t>05:37:11  pipeline=in_progress   staging/health=200</w:t>
+        <w:br/>
+      </w:r>
+      <w:r>
+        <w:rPr>
+          <w:rFonts w:ascii="Consolas" w:hAnsi="Consolas" w:eastAsia="Consolas"/>
+          <w:sz w:val="17"/>
+        </w:rPr>
+        <w:t>05:39:51  pipeline=in_progress   staging/health=200</w:t>
+        <w:br/>
+      </w:r>
+      <w:r>
+        <w:rPr>
+          <w:rFonts w:ascii="Consolas" w:hAnsi="Consolas" w:eastAsia="Consolas"/>
+          <w:sz w:val="17"/>
+        </w:rPr>
+        <w:t>05:42:43  pipeline=failure       staging/health=200</w:t>
+      </w:r>
+    </w:p>
+    <w:p>
+      <w:pPr>
+        <w:spacing w:after="120"/>
+      </w:pPr>
+      <w:r>
+        <w:rPr>
+          <w:b/>
+        </w:rPr>
+        <w:t xml:space="preserve">Lo que enseña este resultado: </w:t>
+      </w:r>
+      <w:r>
+        <w:t>staging nunca dejó de responder. Railway no promueve un despliegue cuyo healthcheck falla, así que el anterior siguió atendiendo. La ruta /health configurada en el Laboratorio 1 convirtió una caída segura en un despliegue fallido sin impacto para los usuarios.</w:t>
+      </w:r>
+    </w:p>
+    <w:p>
+      <w:pPr>
+        <w:pStyle w:val="Heading2"/>
+      </w:pPr>
+      <w:r>
+        <w:t>Ronda 2 — Diagnóstico bajo presión</w:t>
       </w:r>
     </w:p>
     <w:p>
@@ -3546,15 +3365,77 @@
           <w:i w:val="0"/>
           <w:sz w:val="22"/>
         </w:rPr>
-        <w:t>Esto no rompe el diseño de la sesión: la automatización que pide la guía no depende del webhook de Railway, sino del job del pipeline que ejecuta railway up. Ese job ya está construido y probado; solo espera el token. Cuando se ejecute, subirá el estado actual del repositorio — railway.json incluido — y el servicio pasará a construir el backend.</w:t>
+        <w:t>Cronómetro desde las 05:42:43, cuando el pipeline marcó el fallo. Ruta seguida: Railway → staging → Deployments → despliegue FAILED → Deploy Logs.</w:t>
       </w:r>
     </w:p>
     <w:p>
       <w:pPr>
-        <w:pStyle w:val="Heading2"/>
+        <w:spacing w:before="160" w:after="40"/>
+        <w:jc w:val="center"/>
       </w:pPr>
       <w:r>
-        <w:t>Se intentó forzar el redespliegue sin éxito</w:t>
+        <w:drawing>
+          <wp:inline xmlns:a="http://schemas.openxmlformats.org/drawingml/2006/main" xmlns:pic="http://schemas.openxmlformats.org/drawingml/2006/picture">
+            <wp:extent cx="5577840" cy="2485549"/>
+            <wp:docPr id="11" name="Picture 11"/>
+            <wp:cNvGraphicFramePr>
+              <a:graphicFrameLocks noChangeAspect="1"/>
+            </wp:cNvGraphicFramePr>
+            <a:graphic>
+              <a:graphicData uri="http://schemas.openxmlformats.org/drawingml/2006/picture">
+                <pic:pic>
+                  <pic:nvPicPr>
+                    <pic:cNvPr id="0" name="12-logs-del-error.jpg"/>
+                    <pic:cNvPicPr/>
+                  </pic:nvPicPr>
+                  <pic:blipFill>
+                    <a:blip r:embed="rId19"/>
+                    <a:stretch>
+                      <a:fillRect/>
+                    </a:stretch>
+                  </pic:blipFill>
+                  <pic:spPr>
+                    <a:xfrm>
+                      <a:off x="0" y="0"/>
+                      <a:ext cx="5577840" cy="2485549"/>
+                    </a:xfrm>
+                    <a:prstGeom prst="rect"/>
+                  </pic:spPr>
+                </pic:pic>
+              </a:graphicData>
+            </a:graphic>
+          </wp:inline>
+        </w:drawing>
+      </w:r>
+    </w:p>
+    <w:p>
+      <w:pPr>
+        <w:spacing w:after="280"/>
+        <w:jc w:val="center"/>
+      </w:pPr>
+      <w:r>
+        <w:rPr>
+          <w:i/>
+          <w:color w:val="595959"/>
+          <w:sz w:val="18"/>
+        </w:rPr>
+        <w:t>Figura 11. Los Deploy Logs muestran la excepción, el archivo y la línea exacta, repetidos por cada reinicio del contenedor.</w:t>
+      </w:r>
+    </w:p>
+    <w:p>
+      <w:pPr>
+        <w:spacing w:after="160"/>
+        <w:ind w:left="432"/>
+      </w:pPr>
+      <w:r>
+        <w:rPr>
+          <w:b/>
+          <w:color w:val="1F4E79"/>
+        </w:rPr>
+        <w:t xml:space="preserve">Causa, en una frase: </w:t>
+      </w:r>
+      <w:r>
+        <w:t>el servidor muere en src/server/index.js:16 porque la validación de arranque consulta process.env.DATABASE_URLL (con una L de más), una variable que no existe. El mensaje de error engaña: nombra DATABASE_URL, que sí está definida en Railway.</w:t>
       </w:r>
     </w:p>
     <w:p>
@@ -3567,20 +3448,7 @@
           <w:i w:val="0"/>
           <w:sz w:val="22"/>
         </w:rPr>
-        <w:t>Se probaron varias vías desde el panel: el menú del despliegue ofrece Redeploy, pero esa opción reconstruye el mismo commit, no el último de main, de modo que no tomaría railway.json. Se dejó constancia en lugar de aplicar un arreglo que no resolvía el problema.</w:t>
-      </w:r>
-    </w:p>
-    <w:p>
-      <w:r>
-        <w:br w:type="page"/>
-      </w:r>
-    </w:p>
-    <w:p>
-      <w:pPr>
-        <w:pStyle w:val="Heading1"/>
-      </w:pPr>
-      <w:r>
-        <w:t>Qué falta y cómo completarlo</w:t>
+        <w:t>Tiempo de diagnóstico: unos 2 minutos, dentro del límite de 10.</w:t>
       </w:r>
     </w:p>
     <w:p>
@@ -3588,73 +3456,7 @@
         <w:pStyle w:val="Heading2"/>
       </w:pPr>
       <w:r>
-        <w:t>Paso 1 — El token (5 minutos, lo hace el estudiante)</w:t>
-      </w:r>
-    </w:p>
-    <w:p>
-      <w:pPr>
-        <w:spacing w:after="60"/>
-        <w:ind w:left="360"/>
-      </w:pPr>
-      <w:r>
-        <w:rPr>
-          <w:b/>
-        </w:rPr>
-        <w:t xml:space="preserve">1.  </w:t>
-      </w:r>
-      <w:r>
-        <w:t>En Railway: foto de perfil → Account Settings → Tokens → crear uno llamado diplomado-m4-ci-cd y copiarlo.</w:t>
-      </w:r>
-    </w:p>
-    <w:p>
-      <w:pPr>
-        <w:spacing w:after="60"/>
-        <w:ind w:left="360"/>
-      </w:pPr>
-      <w:r>
-        <w:rPr>
-          <w:b/>
-        </w:rPr>
-        <w:t xml:space="preserve">2.  </w:t>
-      </w:r>
-      <w:r>
-        <w:t>En GitHub: Settings → Secrets and variables → Actions → New repository secret, con el nombre exacto RAILWAY_TOKEN.</w:t>
-      </w:r>
-    </w:p>
-    <w:p>
-      <w:pPr>
-        <w:spacing w:after="120"/>
-      </w:pPr>
-      <w:r>
-        <w:rPr>
-          <w:b/>
-        </w:rPr>
-        <w:t xml:space="preserve">Por qué no lo hizo el asistente: </w:t>
-      </w:r>
-      <w:r>
-        <w:t>un token de despliegue es una credencial real — quien la posee puede publicar código en producción. Manejar ese tipo de valor queda fuera de lo que corresponde delegar. Es distinto de la Sesión 6, donde los valores eran ficticios por diseño del propio laboratorio.</w:t>
-      </w:r>
-    </w:p>
-    <w:p>
-      <w:pPr>
-        <w:spacing w:after="120"/>
-      </w:pPr>
-      <w:r>
-        <w:rPr>
-          <w:b/>
-        </w:rPr>
-        <w:t xml:space="preserve">Nota de seguridad: </w:t>
-      </w:r>
-      <w:r>
-        <w:t>durante la sesión se compartió un token por el chat. Se recomendó revocarlo y generar uno nuevo, pegándolo directamente en GitHub. Es el mismo criterio practicado en la Auditoría de Fugas: una credencial que pasa por un canal no controlado se considera comprometida y se rota.</w:t>
-      </w:r>
-    </w:p>
-    <w:p>
-      <w:pPr>
-        <w:pStyle w:val="Heading2"/>
-      </w:pPr>
-      <w:r>
-        <w:t>Paso 2 — Lo que se destraba solo</w:t>
+        <w:t>Ronda 3 — Rollback y verificación</w:t>
       </w:r>
     </w:p>
     <w:p>
@@ -3667,7 +3469,99 @@
           <w:i w:val="0"/>
           <w:sz w:val="22"/>
         </w:rPr>
-        <w:t>Con el Secret cargado, el siguiente merge a main ejecuta railway up y el servicio pasa a construir Dockerfile.backend. A partir de ahí /health devuelve JSON y el healthcheck de Railway puede ponerse en verde.</w:t>
+        <w:t>En el historial de Deployments, sobre el último despliegue sano: menú ⋮ → Redeploy → confirmar.</w:t>
+      </w:r>
+    </w:p>
+    <w:p>
+      <w:pPr>
+        <w:spacing w:before="160" w:after="40"/>
+        <w:jc w:val="center"/>
+      </w:pPr>
+      <w:r>
+        <w:drawing>
+          <wp:inline xmlns:a="http://schemas.openxmlformats.org/drawingml/2006/main" xmlns:pic="http://schemas.openxmlformats.org/drawingml/2006/picture">
+            <wp:extent cx="5577840" cy="2485549"/>
+            <wp:docPr id="12" name="Picture 12"/>
+            <wp:cNvGraphicFramePr>
+              <a:graphicFrameLocks noChangeAspect="1"/>
+            </wp:cNvGraphicFramePr>
+            <a:graphic>
+              <a:graphicData uri="http://schemas.openxmlformats.org/drawingml/2006/picture">
+                <pic:pic>
+                  <pic:nvPicPr>
+                    <pic:cNvPr id="0" name="13-rollback-staging-sano.jpg"/>
+                    <pic:cNvPicPr/>
+                  </pic:nvPicPr>
+                  <pic:blipFill>
+                    <a:blip r:embed="rId20"/>
+                    <a:stretch>
+                      <a:fillRect/>
+                    </a:stretch>
+                  </pic:blipFill>
+                  <pic:spPr>
+                    <a:xfrm>
+                      <a:off x="0" y="0"/>
+                      <a:ext cx="5577840" cy="2485549"/>
+                    </a:xfrm>
+                    <a:prstGeom prst="rect"/>
+                  </pic:spPr>
+                </pic:pic>
+              </a:graphicData>
+            </a:graphic>
+          </wp:inline>
+        </w:drawing>
+      </w:r>
+    </w:p>
+    <w:p>
+      <w:pPr>
+        <w:spacing w:after="280"/>
+        <w:jc w:val="center"/>
+      </w:pPr>
+      <w:r>
+        <w:rPr>
+          <w:i/>
+          <w:color w:val="595959"/>
+          <w:sz w:val="18"/>
+        </w:rPr>
+        <w:t>Figura 12. Después del rollback: el despliegue ACTIVE es la versión sana redesplegada y el servicio figura Online, sin el aviso de fallo.</w:t>
+      </w:r>
+    </w:p>
+    <w:p>
+      <w:pPr>
+        <w:spacing w:before="120" w:after="200" w:line="240" w:lineRule="auto"/>
+        <w:ind w:left="216"/>
+        <w:shd w:val="clear" w:color="auto" w:fill="F2F2F2"/>
+      </w:pPr>
+      <w:r>
+        <w:rPr>
+          <w:rFonts w:ascii="Consolas" w:hAnsi="Consolas" w:eastAsia="Consolas"/>
+          <w:sz w:val="17"/>
+        </w:rPr>
+        <w:t>rollback lanzado 05:45:51 UTC</w:t>
+        <w:br/>
+      </w:r>
+      <w:r>
+        <w:rPr>
+          <w:rFonts w:ascii="Consolas" w:hAnsi="Consolas" w:eastAsia="Consolas"/>
+          <w:sz w:val="17"/>
+        </w:rPr>
+        <w:t>05:45:52 {"estado":"ok","status":"ok","almacen":"postgres"}</w:t>
+        <w:br/>
+      </w:r>
+      <w:r>
+        <w:rPr>
+          <w:rFonts w:ascii="Consolas" w:hAnsi="Consolas" w:eastAsia="Consolas"/>
+          <w:sz w:val="17"/>
+        </w:rPr>
+        <w:t>05:47:57 {"estado":"ok","status":"ok","almacen":"postgres"}</w:t>
+        <w:br/>
+      </w:r>
+      <w:r>
+        <w:rPr>
+          <w:rFonts w:ascii="Consolas" w:hAnsi="Consolas" w:eastAsia="Consolas"/>
+          <w:sz w:val="17"/>
+        </w:rPr>
+        <w:t>05:49:41 {"estado":"ok","status":"ok","almacen":"postgres"}</w:t>
       </w:r>
     </w:p>
     <w:p>
@@ -3675,52 +3569,376 @@
         <w:pStyle w:val="Heading2"/>
       </w:pPr>
       <w:r>
-        <w:t>Paso 3 — Lo que queda por hacer en Railway</w:t>
+        <w:t>La corrección, por el flujo normal</w:t>
+      </w:r>
+    </w:p>
+    <w:p>
+      <w:pPr>
+        <w:spacing w:after="120"/>
+      </w:pPr>
+      <w:r>
+        <w:rPr>
+          <w:b w:val="0"/>
+          <w:i w:val="0"/>
+          <w:sz w:val="22"/>
+        </w:rPr>
+        <w:t>Recién con el servicio estable se corrigió el error real, en su propia rama y con su propio Pull Request (#16):</w:t>
+      </w:r>
+    </w:p>
+    <w:p>
+      <w:pPr>
+        <w:spacing w:before="120" w:after="200" w:line="240" w:lineRule="auto"/>
+        <w:ind w:left="216"/>
+        <w:shd w:val="clear" w:color="auto" w:fill="F2F2F2"/>
+      </w:pPr>
+      <w:r>
+        <w:rPr>
+          <w:rFonts w:ascii="Consolas" w:hAnsi="Consolas" w:eastAsia="Consolas"/>
+          <w:sz w:val="17"/>
+        </w:rPr>
+        <w:t>-if (!process.env.DATABASE_URLL) {</w:t>
+        <w:br/>
+      </w:r>
+      <w:r>
+        <w:rPr>
+          <w:rFonts w:ascii="Consolas" w:hAnsi="Consolas" w:eastAsia="Consolas"/>
+          <w:sz w:val="17"/>
+        </w:rPr>
+        <w:t>+if (!process.env.DATABASE_URL) {</w:t>
+      </w:r>
+    </w:p>
+    <w:p>
+      <w:pPr>
+        <w:spacing w:after="120"/>
+      </w:pPr>
+      <w:r>
+        <w:rPr>
+          <w:b w:val="0"/>
+          <w:i w:val="0"/>
+          <w:sz w:val="22"/>
+        </w:rPr>
+        <w:t>Tras el merge, el pipeline de main terminó en verde en 1 min 55 s. Esta vez el despliegue a staging pasó el healthcheck y quedó ACTIVE. El historial de Railway resume el incidente completo, de abajo hacia arriba: el despliegue sano, el FAILED del simulacro, el redeploy del rollback y la corrección.</w:t>
+      </w:r>
+    </w:p>
+    <w:p>
+      <w:pPr>
+        <w:spacing w:before="160" w:after="40"/>
+        <w:jc w:val="center"/>
+      </w:pPr>
+      <w:r>
+        <w:drawing>
+          <wp:inline xmlns:a="http://schemas.openxmlformats.org/drawingml/2006/main" xmlns:pic="http://schemas.openxmlformats.org/drawingml/2006/picture">
+            <wp:extent cx="5577840" cy="2485549"/>
+            <wp:docPr id="13" name="Picture 13"/>
+            <wp:cNvGraphicFramePr>
+              <a:graphicFrameLocks noChangeAspect="1"/>
+            </wp:cNvGraphicFramePr>
+            <a:graphic>
+              <a:graphicData uri="http://schemas.openxmlformats.org/drawingml/2006/picture">
+                <pic:pic>
+                  <pic:nvPicPr>
+                    <pic:cNvPr id="0" name="15-historial-del-incidente.jpg"/>
+                    <pic:cNvPicPr/>
+                  </pic:nvPicPr>
+                  <pic:blipFill>
+                    <a:blip r:embed="rId21"/>
+                    <a:stretch>
+                      <a:fillRect/>
+                    </a:stretch>
+                  </pic:blipFill>
+                  <pic:spPr>
+                    <a:xfrm>
+                      <a:off x="0" y="0"/>
+                      <a:ext cx="5577840" cy="2485549"/>
+                    </a:xfrm>
+                    <a:prstGeom prst="rect"/>
+                  </pic:spPr>
+                </pic:pic>
+              </a:graphicData>
+            </a:graphic>
+          </wp:inline>
+        </w:drawing>
+      </w:r>
+    </w:p>
+    <w:p>
+      <w:pPr>
+        <w:spacing w:after="280"/>
+        <w:jc w:val="center"/>
+      </w:pPr>
+      <w:r>
+        <w:rPr>
+          <w:i/>
+          <w:color w:val="595959"/>
+          <w:sz w:val="18"/>
+        </w:rPr>
+        <w:t>Figura 13. Historial de staging: el FAILED del simulacro, el redeploy del rollback y, arriba, los despliegues posteriores ya sanos.</w:t>
+      </w:r>
+    </w:p>
+    <w:p>
+      <w:pPr>
+        <w:pStyle w:val="Heading3"/>
+      </w:pPr>
+      <w:r>
+        <w:t>Checkpoint del Laboratorio 3</w:t>
       </w:r>
     </w:p>
     <w:p>
       <w:pPr>
         <w:spacing w:after="60"/>
-        <w:ind w:left="360"/>
+        <w:ind w:left="288"/>
       </w:pPr>
       <w:r>
         <w:rPr>
           <w:b/>
+          <w:color w:val="1E7B34"/>
+          <w:sz w:val="24"/>
         </w:rPr>
-        <w:t xml:space="preserve">1.  </w:t>
+        <w:t xml:space="preserve">☑  </w:t>
       </w:r>
       <w:r>
-        <w:t>Crear el ambiente production, separado del actual, con su propio plugin de PostgreSQL y sus variables independientes (JWT_SECRET distinto al de staging).</w:t>
+        <w:rPr>
+          <w:sz w:val="22"/>
+        </w:rPr>
+        <w:t>El servicio tiene una ruta /health configurada como Healthcheck Path en Railway.</w:t>
       </w:r>
     </w:p>
     <w:p>
       <w:pPr>
         <w:spacing w:after="60"/>
-        <w:ind w:left="360"/>
+        <w:ind w:left="288"/>
       </w:pPr>
       <w:r>
         <w:rPr>
           <w:b/>
+          <w:color w:val="1E7B34"/>
+          <w:sz w:val="24"/>
         </w:rPr>
-        <w:t xml:space="preserve">2.  </w:t>
+        <w:t xml:space="preserve">☑  </w:t>
       </w:r>
       <w:r>
-        <w:t>Ejecutar el despliegue manual desde Actions → Run workflow escribiendo DEPLOY, y comprobar que solo se actualiza producción.</w:t>
+        <w:rPr>
+          <w:sz w:val="22"/>
+        </w:rPr>
+        <w:t>Se provocó un despliegue defectuoso real y se diagnosticó con los logs y el healthcheck.</w:t>
       </w:r>
     </w:p>
     <w:p>
       <w:pPr>
         <w:spacing w:after="60"/>
-        <w:ind w:left="360"/>
+        <w:ind w:left="288"/>
       </w:pPr>
       <w:r>
         <w:rPr>
           <w:b/>
+          <w:color w:val="1E7B34"/>
+          <w:sz w:val="24"/>
         </w:rPr>
-        <w:t xml:space="preserve">3.  </w:t>
+        <w:t xml:space="preserve">☑  </w:t>
       </w:r>
       <w:r>
-        <w:t>Laboratorio 3: romper el arranque a propósito, ver el healthcheck en rojo, diagnosticar en los logs, hacer rollback al despliegue anterior y corregir por el flujo normal.</w:t>
+        <w:rPr>
+          <w:sz w:val="22"/>
+        </w:rPr>
+        <w:t>Se ejecutó un rollback exitoso y luego se corrigió el error real por el flujo normal.</w:t>
+      </w:r>
+    </w:p>
+    <w:p>
+      <w:pPr>
+        <w:pStyle w:val="Heading2"/>
+      </w:pPr>
+      <w:r>
+        <w:t>Insignias</w:t>
+      </w:r>
+    </w:p>
+    <w:tbl>
+      <w:tblPr>
+        <w:tblStyle w:val="TableGrid"/>
+        <w:tblW w:type="auto" w:w="0"/>
+        <w:jc w:val="center"/>
+        <w:tblLook w:firstColumn="1" w:firstRow="1" w:lastColumn="0" w:lastRow="0" w:noHBand="0" w:noVBand="1" w:val="04A0"/>
+      </w:tblPr>
+      <w:tblGrid>
+        <w:gridCol w:w="3120"/>
+        <w:gridCol w:w="3120"/>
+        <w:gridCol w:w="3120"/>
+      </w:tblGrid>
+      <w:tr>
+        <w:tc>
+          <w:tcPr>
+            <w:tcW w:type="dxa" w:w="3168"/>
+            <w:shd w:val="clear" w:color="auto" w:fill="1F4E79"/>
+          </w:tcPr>
+          <w:p>
+            <w:pPr>
+              <w:spacing w:after="40"/>
+            </w:pPr>
+            <w:r/>
+            <w:r>
+              <w:rPr>
+                <w:b/>
+                <w:color w:val="FFFFFF"/>
+                <w:sz w:val="20"/>
+              </w:rPr>
+              <w:t>Insignia</w:t>
+            </w:r>
+          </w:p>
+        </w:tc>
+        <w:tc>
+          <w:tcPr>
+            <w:tcW w:type="dxa" w:w="1152"/>
+            <w:shd w:val="clear" w:color="auto" w:fill="1F4E79"/>
+          </w:tcPr>
+          <w:p>
+            <w:pPr>
+              <w:spacing w:after="40"/>
+            </w:pPr>
+            <w:r/>
+            <w:r>
+              <w:rPr>
+                <w:b/>
+                <w:color w:val="FFFFFF"/>
+                <w:sz w:val="20"/>
+              </w:rPr>
+              <w:t>Puntos</w:t>
+            </w:r>
+          </w:p>
+        </w:tc>
+        <w:tc>
+          <w:tcPr>
+            <w:tcW w:type="dxa" w:w="5040"/>
+            <w:shd w:val="clear" w:color="auto" w:fill="1F4E79"/>
+          </w:tcPr>
+          <w:p>
+            <w:pPr>
+              <w:spacing w:after="40"/>
+            </w:pPr>
+            <w:r/>
+            <w:r>
+              <w:rPr>
+                <w:b/>
+                <w:color w:val="FFFFFF"/>
+                <w:sz w:val="20"/>
+              </w:rPr>
+              <w:t>Evidencia</w:t>
+            </w:r>
+          </w:p>
+        </w:tc>
+      </w:tr>
+      <w:tr>
+        <w:tc>
+          <w:tcPr>
+            <w:tcW w:type="dxa" w:w="3168"/>
+          </w:tcPr>
+          <w:p>
+            <w:pPr>
+              <w:spacing w:after="40"/>
+            </w:pPr>
+            <w:r/>
+            <w:r>
+              <w:rPr>
+                <w:sz w:val="20"/>
+              </w:rPr>
+              <w:t>🩺 Médico de Servicios</w:t>
+            </w:r>
+          </w:p>
+        </w:tc>
+        <w:tc>
+          <w:tcPr>
+            <w:tcW w:type="dxa" w:w="1152"/>
+          </w:tcPr>
+          <w:p>
+            <w:pPr>
+              <w:spacing w:after="40"/>
+            </w:pPr>
+            <w:r/>
+            <w:r>
+              <w:rPr>
+                <w:sz w:val="20"/>
+              </w:rPr>
+              <w:t>10</w:t>
+            </w:r>
+          </w:p>
+        </w:tc>
+        <w:tc>
+          <w:tcPr>
+            <w:tcW w:type="dxa" w:w="5040"/>
+          </w:tcPr>
+          <w:p>
+            <w:pPr>
+              <w:spacing w:after="40"/>
+            </w:pPr>
+            <w:r/>
+            <w:r>
+              <w:rPr>
+                <w:sz w:val="20"/>
+              </w:rPr>
+              <w:t>Causa identificada solo con logs y healthcheck (Figura 11)</w:t>
+            </w:r>
+          </w:p>
+        </w:tc>
+      </w:tr>
+      <w:tr>
+        <w:tc>
+          <w:tcPr>
+            <w:tcW w:type="dxa" w:w="3168"/>
+          </w:tcPr>
+          <w:p>
+            <w:pPr>
+              <w:spacing w:after="40"/>
+            </w:pPr>
+            <w:r/>
+            <w:r>
+              <w:rPr>
+                <w:sz w:val="20"/>
+              </w:rPr>
+              <w:t>⏪ Héroe del Rollback</w:t>
+            </w:r>
+          </w:p>
+        </w:tc>
+        <w:tc>
+          <w:tcPr>
+            <w:tcW w:type="dxa" w:w="1152"/>
+          </w:tcPr>
+          <w:p>
+            <w:pPr>
+              <w:spacing w:after="40"/>
+            </w:pPr>
+            <w:r/>
+            <w:r>
+              <w:rPr>
+                <w:sz w:val="20"/>
+              </w:rPr>
+              <w:t>15</w:t>
+            </w:r>
+          </w:p>
+        </w:tc>
+        <w:tc>
+          <w:tcPr>
+            <w:tcW w:type="dxa" w:w="5040"/>
+          </w:tcPr>
+          <w:p>
+            <w:pPr>
+              <w:spacing w:after="40"/>
+            </w:pPr>
+            <w:r/>
+            <w:r>
+              <w:rPr>
+                <w:sz w:val="20"/>
+              </w:rPr>
+              <w:t>Rollback exitoso, con el servicio sano de nuevo (Figura 12)</w:t>
+            </w:r>
+          </w:p>
+        </w:tc>
+      </w:tr>
+    </w:tbl>
+    <w:p>
+      <w:pPr>
+        <w:spacing w:after="40"/>
+      </w:pPr>
+    </w:p>
+    <w:p>
+      <w:r>
+        <w:br w:type="page"/>
       </w:r>
     </w:p>
     <w:p>
@@ -3852,10 +4070,10 @@
             <w:r>
               <w:rPr>
                 <w:b/>
-                <w:color w:val="B56B00"/>
+                <w:color w:val="1E7B34"/>
                 <w:sz w:val="20"/>
               </w:rPr>
-              <w:t>Pendiente</w:t>
+              <w:t>Cumplido</w:t>
             </w:r>
           </w:p>
         </w:tc>
@@ -3966,10 +4184,10 @@
             <w:r>
               <w:rPr>
                 <w:b/>
-                <w:color w:val="B56B00"/>
+                <w:color w:val="1E7B34"/>
                 <w:sz w:val="20"/>
               </w:rPr>
-              <w:t>Pendiente</w:t>
+              <w:t>Cumplido</w:t>
             </w:r>
           </w:p>
         </w:tc>
@@ -4004,10 +4222,10 @@
             <w:r>
               <w:rPr>
                 <w:b/>
-                <w:color w:val="B56B00"/>
+                <w:color w:val="1E7B34"/>
                 <w:sz w:val="20"/>
               </w:rPr>
-              <w:t>Pendiente</w:t>
+              <w:t>Cumplido</w:t>
             </w:r>
           </w:p>
         </w:tc>
@@ -4023,198 +4241,68 @@
         <w:pStyle w:val="Heading2"/>
       </w:pPr>
       <w:r>
-        <w:t>Insignias</w:t>
+        <w:t>Lo aprendido</w:t>
       </w:r>
     </w:p>
-    <w:tbl>
-      <w:tblPr>
-        <w:tblStyle w:val="TableGrid"/>
-        <w:tblW w:type="auto" w:w="0"/>
-        <w:jc w:val="center"/>
-        <w:tblLook w:firstColumn="1" w:firstRow="1" w:lastColumn="0" w:lastRow="0" w:noHBand="0" w:noVBand="1" w:val="04A0"/>
-      </w:tblPr>
-      <w:tblGrid>
-        <w:gridCol w:w="3120"/>
-        <w:gridCol w:w="3120"/>
-        <w:gridCol w:w="3120"/>
-      </w:tblGrid>
-      <w:tr>
-        <w:tc>
-          <w:tcPr>
-            <w:tcW w:type="dxa" w:w="4320"/>
-            <w:shd w:val="clear" w:color="auto" w:fill="1F4E79"/>
-          </w:tcPr>
-          <w:p>
-            <w:pPr>
-              <w:spacing w:after="40"/>
-            </w:pPr>
-            <w:r/>
-            <w:r>
-              <w:rPr>
-                <w:b/>
-                <w:color w:val="FFFFFF"/>
-                <w:sz w:val="20"/>
-              </w:rPr>
-              <w:t>Insignia</w:t>
-            </w:r>
-          </w:p>
-        </w:tc>
-        <w:tc>
-          <w:tcPr>
-            <w:tcW w:type="dxa" w:w="1440"/>
-            <w:shd w:val="clear" w:color="auto" w:fill="1F4E79"/>
-          </w:tcPr>
-          <w:p>
-            <w:pPr>
-              <w:spacing w:after="40"/>
-            </w:pPr>
-            <w:r/>
-            <w:r>
-              <w:rPr>
-                <w:b/>
-                <w:color w:val="FFFFFF"/>
-                <w:sz w:val="20"/>
-              </w:rPr>
-              <w:t>Puntos</w:t>
-            </w:r>
-          </w:p>
-        </w:tc>
-        <w:tc>
-          <w:tcPr>
-            <w:tcW w:type="dxa" w:w="3600"/>
-            <w:shd w:val="clear" w:color="auto" w:fill="1F4E79"/>
-          </w:tcPr>
-          <w:p>
-            <w:pPr>
-              <w:spacing w:after="40"/>
-            </w:pPr>
-            <w:r/>
-            <w:r>
-              <w:rPr>
-                <w:b/>
-                <w:color w:val="FFFFFF"/>
-                <w:sz w:val="20"/>
-              </w:rPr>
-              <w:t>Estado</w:t>
-            </w:r>
-          </w:p>
-        </w:tc>
-      </w:tr>
-      <w:tr>
-        <w:tc>
-          <w:tcPr>
-            <w:tcW w:type="dxa" w:w="4320"/>
-          </w:tcPr>
-          <w:p>
-            <w:pPr>
-              <w:spacing w:after="40"/>
-            </w:pPr>
-            <w:r/>
-            <w:r>
-              <w:rPr>
-                <w:sz w:val="20"/>
-              </w:rPr>
-              <w:t>🩺 Médico de Servicios</w:t>
-            </w:r>
-          </w:p>
-        </w:tc>
-        <w:tc>
-          <w:tcPr>
-            <w:tcW w:type="dxa" w:w="1440"/>
-          </w:tcPr>
-          <w:p>
-            <w:pPr>
-              <w:spacing w:after="40"/>
-            </w:pPr>
-            <w:r/>
-            <w:r>
-              <w:rPr>
-                <w:sz w:val="20"/>
-              </w:rPr>
-              <w:t>10</w:t>
-            </w:r>
-          </w:p>
-        </w:tc>
-        <w:tc>
-          <w:tcPr>
-            <w:tcW w:type="dxa" w:w="3600"/>
-          </w:tcPr>
-          <w:p>
-            <w:pPr>
-              <w:spacing w:after="40"/>
-            </w:pPr>
-            <w:r/>
-            <w:r>
-              <w:rPr>
-                <w:b/>
-                <w:color w:val="B56B00"/>
-                <w:sz w:val="20"/>
-              </w:rPr>
-              <w:t>Pendiente</w:t>
-            </w:r>
-          </w:p>
-        </w:tc>
-      </w:tr>
-      <w:tr>
-        <w:tc>
-          <w:tcPr>
-            <w:tcW w:type="dxa" w:w="4320"/>
-          </w:tcPr>
-          <w:p>
-            <w:pPr>
-              <w:spacing w:after="40"/>
-            </w:pPr>
-            <w:r/>
-            <w:r>
-              <w:rPr>
-                <w:sz w:val="20"/>
-              </w:rPr>
-              <w:t>⏪ Héroe del Rollback</w:t>
-            </w:r>
-          </w:p>
-        </w:tc>
-        <w:tc>
-          <w:tcPr>
-            <w:tcW w:type="dxa" w:w="1440"/>
-          </w:tcPr>
-          <w:p>
-            <w:pPr>
-              <w:spacing w:after="40"/>
-            </w:pPr>
-            <w:r/>
-            <w:r>
-              <w:rPr>
-                <w:sz w:val="20"/>
-              </w:rPr>
-              <w:t>15</w:t>
-            </w:r>
-          </w:p>
-        </w:tc>
-        <w:tc>
-          <w:tcPr>
-            <w:tcW w:type="dxa" w:w="3600"/>
-          </w:tcPr>
-          <w:p>
-            <w:pPr>
-              <w:spacing w:after="40"/>
-            </w:pPr>
-            <w:r/>
-            <w:r>
-              <w:rPr>
-                <w:b/>
-                <w:color w:val="B56B00"/>
-                <w:sz w:val="20"/>
-              </w:rPr>
-              <w:t>Pendiente</w:t>
-            </w:r>
-          </w:p>
-        </w:tc>
-      </w:tr>
-    </w:tbl>
     <w:p>
       <w:pPr>
-        <w:spacing w:after="40"/>
+        <w:spacing w:after="60"/>
+        <w:ind w:left="360"/>
       </w:pPr>
+      <w:r>
+        <w:rPr>
+          <w:b/>
+        </w:rPr>
+        <w:t xml:space="preserve">1.  </w:t>
+      </w:r>
+      <w:r>
+        <w:t>Un token no es solo un valor secreto: también tiene un alcance. El de workspace no despliega; el de proyecto sí, y limitado a un ambiente.</w:t>
+      </w:r>
+    </w:p>
+    <w:p>
+      <w:pPr>
+        <w:spacing w:after="60"/>
+        <w:ind w:left="360"/>
+      </w:pPr>
+      <w:r>
+        <w:rPr>
+          <w:b/>
+        </w:rPr>
+        <w:t xml:space="preserve">2.  </w:t>
+      </w:r>
+      <w:r>
+        <w:t>La documentación y la plataforma cambian. railway.json era la forma recomendada y hoy se ignora en servicios nuevos. Leer el log («Deploying as astro static site») evitó perseguir el error equivocado.</w:t>
+      </w:r>
+    </w:p>
+    <w:p>
+      <w:pPr>
+        <w:spacing w:after="60"/>
+        <w:ind w:left="360"/>
+      </w:pPr>
+      <w:r>
+        <w:rPr>
+          <w:b/>
+        </w:rPr>
+        <w:t xml:space="preserve">3.  </w:t>
+      </w:r>
+      <w:r>
+        <w:t>Un healthcheck bien configurado es la primera línea del rollback: impidió que el despliegue roto llegara a atender a nadie.</w:t>
+      </w:r>
+    </w:p>
+    <w:p>
+      <w:pPr>
+        <w:spacing w:after="60"/>
+        <w:ind w:left="360"/>
+      </w:pPr>
+      <w:r>
+        <w:rPr>
+          <w:b/>
+        </w:rPr>
+        <w:t xml:space="preserve">4.  </w:t>
+      </w:r>
+      <w:r>
+        <w:t>Pasar el quality gate no garantiza que el servicio arranque. El error del simulacro vivía en el único archivo que ninguna prueba ejecuta.</w:t>
+      </w:r>
     </w:p>
     <w:p>
       <w:r>
@@ -4243,7 +4331,7 @@
       <w:tr>
         <w:tc>
           <w:tcPr>
-            <w:tcW w:type="dxa" w:w="4608"/>
+            <w:tcW w:type="dxa" w:w="4752"/>
             <w:shd w:val="clear" w:color="auto" w:fill="1F4E79"/>
           </w:tcPr>
           <w:p>
@@ -4263,7 +4351,7 @@
         </w:tc>
         <w:tc>
           <w:tcPr>
-            <w:tcW w:type="dxa" w:w="4752"/>
+            <w:tcW w:type="dxa" w:w="4608"/>
             <w:shd w:val="clear" w:color="auto" w:fill="1F4E79"/>
           </w:tcPr>
           <w:p>
@@ -4285,7 +4373,7 @@
       <w:tr>
         <w:tc>
           <w:tcPr>
-            <w:tcW w:type="dxa" w:w="4608"/>
+            <w:tcW w:type="dxa" w:w="4752"/>
           </w:tcPr>
           <w:p>
             <w:pPr>
@@ -4302,7 +4390,7 @@
         </w:tc>
         <w:tc>
           <w:tcPr>
-            <w:tcW w:type="dxa" w:w="4752"/>
+            <w:tcW w:type="dxa" w:w="4608"/>
           </w:tcPr>
           <w:p>
             <w:pPr>
@@ -4313,7 +4401,7 @@
               <w:rPr>
                 <w:sz w:val="20"/>
               </w:rPr>
-              <w:t>La cuenta de Railway antes de empezar</w:t>
+              <w:t>La cuenta antes de empezar</w:t>
             </w:r>
           </w:p>
         </w:tc>
@@ -4321,7 +4409,7 @@
       <w:tr>
         <w:tc>
           <w:tcPr>
-            <w:tcW w:type="dxa" w:w="4608"/>
+            <w:tcW w:type="dxa" w:w="4752"/>
           </w:tcPr>
           <w:p>
             <w:pPr>
@@ -4338,7 +4426,7 @@
         </w:tc>
         <w:tc>
           <w:tcPr>
-            <w:tcW w:type="dxa" w:w="4752"/>
+            <w:tcW w:type="dxa" w:w="4608"/>
           </w:tcPr>
           <w:p>
             <w:pPr>
@@ -4349,7 +4437,7 @@
               <w:rPr>
                 <w:sz w:val="20"/>
               </w:rPr>
-              <w:t>PostgreSQL aprovisionándose con su volumen</w:t>
+              <w:t>PostgreSQL con su volumen</w:t>
             </w:r>
           </w:p>
         </w:tc>
@@ -4357,7 +4445,7 @@
       <w:tr>
         <w:tc>
           <w:tcPr>
-            <w:tcW w:type="dxa" w:w="4608"/>
+            <w:tcW w:type="dxa" w:w="4752"/>
           </w:tcPr>
           <w:p>
             <w:pPr>
@@ -4374,7 +4462,7 @@
         </w:tc>
         <w:tc>
           <w:tcPr>
-            <w:tcW w:type="dxa" w:w="4752"/>
+            <w:tcW w:type="dxa" w:w="4608"/>
           </w:tcPr>
           <w:p>
             <w:pPr>
@@ -4385,7 +4473,7 @@
               <w:rPr>
                 <w:sz w:val="20"/>
               </w:rPr>
-              <w:t>Las tres variables enlazadas al plugin</w:t>
+              <w:t>Variables enlazadas al plugin</w:t>
             </w:r>
           </w:p>
         </w:tc>
@@ -4393,7 +4481,7 @@
       <w:tr>
         <w:tc>
           <w:tcPr>
-            <w:tcW w:type="dxa" w:w="4608"/>
+            <w:tcW w:type="dxa" w:w="4752"/>
           </w:tcPr>
           <w:p>
             <w:pPr>
@@ -4410,7 +4498,7 @@
         </w:tc>
         <w:tc>
           <w:tcPr>
-            <w:tcW w:type="dxa" w:w="4752"/>
+            <w:tcW w:type="dxa" w:w="4608"/>
           </w:tcPr>
           <w:p>
             <w:pPr>
@@ -4421,7 +4509,7 @@
               <w:rPr>
                 <w:sz w:val="20"/>
               </w:rPr>
-              <w:t>Ambos servicios en línea y dominio asignado</w:t>
+              <w:t>Servicios en línea y dominio</w:t>
             </w:r>
           </w:p>
         </w:tc>
@@ -4429,7 +4517,7 @@
       <w:tr>
         <w:tc>
           <w:tcPr>
-            <w:tcW w:type="dxa" w:w="4608"/>
+            <w:tcW w:type="dxa" w:w="4752"/>
           </w:tcPr>
           <w:p>
             <w:pPr>
@@ -4446,7 +4534,7 @@
         </w:tc>
         <w:tc>
           <w:tcPr>
-            <w:tcW w:type="dxa" w:w="4752"/>
+            <w:tcW w:type="dxa" w:w="4608"/>
           </w:tcPr>
           <w:p>
             <w:pPr>
@@ -4457,7 +4545,7 @@
               <w:rPr>
                 <w:sz w:val="20"/>
               </w:rPr>
-              <w:t>El despliegue activo, anterior a railway.json</w:t>
+              <w:t>Primer despliegue, que servía Astro</w:t>
             </w:r>
           </w:p>
         </w:tc>
@@ -4465,7 +4553,7 @@
       <w:tr>
         <w:tc>
           <w:tcPr>
-            <w:tcW w:type="dxa" w:w="4608"/>
+            <w:tcW w:type="dxa" w:w="4752"/>
           </w:tcPr>
           <w:p>
             <w:pPr>
@@ -4482,7 +4570,7 @@
         </w:tc>
         <w:tc>
           <w:tcPr>
-            <w:tcW w:type="dxa" w:w="4752"/>
+            <w:tcW w:type="dxa" w:w="4608"/>
           </w:tcPr>
           <w:p>
             <w:pPr>
@@ -4493,7 +4581,7 @@
               <w:rPr>
                 <w:sz w:val="20"/>
               </w:rPr>
-              <w:t>Run #15: en un PR ambos deploys se omiten</w:t>
+              <w:t>Run #15: en un PR se omiten ambos deploys</w:t>
             </w:r>
           </w:p>
         </w:tc>
@@ -4501,7 +4589,7 @@
       <w:tr>
         <w:tc>
           <w:tcPr>
-            <w:tcW w:type="dxa" w:w="4608"/>
+            <w:tcW w:type="dxa" w:w="4752"/>
           </w:tcPr>
           <w:p>
             <w:pPr>
@@ -4518,7 +4606,7 @@
         </w:tc>
         <w:tc>
           <w:tcPr>
-            <w:tcW w:type="dxa" w:w="4752"/>
+            <w:tcW w:type="dxa" w:w="4608"/>
           </w:tcPr>
           <w:p>
             <w:pPr>
@@ -4529,7 +4617,7 @@
               <w:rPr>
                 <w:sz w:val="20"/>
               </w:rPr>
-              <w:t>Pull Request #10 integrado a main</w:t>
+              <w:t>Pull Request #10 integrado</w:t>
             </w:r>
           </w:p>
         </w:tc>
@@ -4537,7 +4625,7 @@
       <w:tr>
         <w:tc>
           <w:tcPr>
-            <w:tcW w:type="dxa" w:w="4608"/>
+            <w:tcW w:type="dxa" w:w="4752"/>
           </w:tcPr>
           <w:p>
             <w:pPr>
@@ -4554,6 +4642,25 @@
         </w:tc>
         <w:tc>
           <w:tcPr>
+            <w:tcW w:type="dxa" w:w="4608"/>
+          </w:tcPr>
+          <w:p>
+            <w:pPr>
+              <w:spacing w:after="40"/>
+            </w:pPr>
+            <w:r/>
+            <w:r>
+              <w:rPr>
+                <w:sz w:val="20"/>
+              </w:rPr>
+              <w:t>Run #16: staging sí, producción no</w:t>
+            </w:r>
+          </w:p>
+        </w:tc>
+      </w:tr>
+      <w:tr>
+        <w:tc>
+          <w:tcPr>
             <w:tcW w:type="dxa" w:w="4752"/>
           </w:tcPr>
           <w:p>
@@ -4565,7 +4672,204 @@
               <w:rPr>
                 <w:sz w:val="20"/>
               </w:rPr>
-              <w:t>Run #16: staging se ejecuta, producción no</w:t>
+              <w:t>09-configuracion-servicio-produccion.jpg</w:t>
+            </w:r>
+          </w:p>
+        </w:tc>
+        <w:tc>
+          <w:tcPr>
+            <w:tcW w:type="dxa" w:w="4608"/>
+          </w:tcPr>
+          <w:p>
+            <w:pPr>
+              <w:spacing w:after="40"/>
+            </w:pPr>
+            <w:r/>
+            <w:r>
+              <w:rPr>
+                <w:sz w:val="20"/>
+              </w:rPr>
+              <w:t>Healthcheck y Dockerfile en el panel</w:t>
+            </w:r>
+          </w:p>
+        </w:tc>
+      </w:tr>
+      <w:tr>
+        <w:tc>
+          <w:tcPr>
+            <w:tcW w:type="dxa" w:w="4752"/>
+          </w:tcPr>
+          <w:p>
+            <w:pPr>
+              <w:spacing w:after="40"/>
+            </w:pPr>
+            <w:r/>
+            <w:r>
+              <w:rPr>
+                <w:sz w:val="20"/>
+              </w:rPr>
+              <w:t>10-run-workflow-deploy.jpg</w:t>
+            </w:r>
+          </w:p>
+        </w:tc>
+        <w:tc>
+          <w:tcPr>
+            <w:tcW w:type="dxa" w:w="4608"/>
+          </w:tcPr>
+          <w:p>
+            <w:pPr>
+              <w:spacing w:after="40"/>
+            </w:pPr>
+            <w:r/>
+            <w:r>
+              <w:rPr>
+                <w:sz w:val="20"/>
+              </w:rPr>
+              <w:t>Disparo manual con DEPLOY</w:t>
+            </w:r>
+          </w:p>
+        </w:tc>
+      </w:tr>
+      <w:tr>
+        <w:tc>
+          <w:tcPr>
+            <w:tcW w:type="dxa" w:w="4752"/>
+          </w:tcPr>
+          <w:p>
+            <w:pPr>
+              <w:spacing w:after="40"/>
+            </w:pPr>
+            <w:r/>
+            <w:r>
+              <w:rPr>
+                <w:sz w:val="20"/>
+              </w:rPr>
+              <w:t>11-staging-healthcheck-fallido.jpg</w:t>
+            </w:r>
+          </w:p>
+        </w:tc>
+        <w:tc>
+          <w:tcPr>
+            <w:tcW w:type="dxa" w:w="4608"/>
+          </w:tcPr>
+          <w:p>
+            <w:pPr>
+              <w:spacing w:after="40"/>
+            </w:pPr>
+            <w:r/>
+            <w:r>
+              <w:rPr>
+                <w:sz w:val="20"/>
+              </w:rPr>
+              <w:t>El despliegue roto, con healthcheck en rojo</w:t>
+            </w:r>
+          </w:p>
+        </w:tc>
+      </w:tr>
+      <w:tr>
+        <w:tc>
+          <w:tcPr>
+            <w:tcW w:type="dxa" w:w="4752"/>
+          </w:tcPr>
+          <w:p>
+            <w:pPr>
+              <w:spacing w:after="40"/>
+            </w:pPr>
+            <w:r/>
+            <w:r>
+              <w:rPr>
+                <w:sz w:val="20"/>
+              </w:rPr>
+              <w:t>12-logs-del-error.jpg</w:t>
+            </w:r>
+          </w:p>
+        </w:tc>
+        <w:tc>
+          <w:tcPr>
+            <w:tcW w:type="dxa" w:w="4608"/>
+          </w:tcPr>
+          <w:p>
+            <w:pPr>
+              <w:spacing w:after="40"/>
+            </w:pPr>
+            <w:r/>
+            <w:r>
+              <w:rPr>
+                <w:sz w:val="20"/>
+              </w:rPr>
+              <w:t>Deploy Logs con la causa del fallo</w:t>
+            </w:r>
+          </w:p>
+        </w:tc>
+      </w:tr>
+      <w:tr>
+        <w:tc>
+          <w:tcPr>
+            <w:tcW w:type="dxa" w:w="4752"/>
+          </w:tcPr>
+          <w:p>
+            <w:pPr>
+              <w:spacing w:after="40"/>
+            </w:pPr>
+            <w:r/>
+            <w:r>
+              <w:rPr>
+                <w:sz w:val="20"/>
+              </w:rPr>
+              <w:t>13-rollback-staging-sano.jpg</w:t>
+            </w:r>
+          </w:p>
+        </w:tc>
+        <w:tc>
+          <w:tcPr>
+            <w:tcW w:type="dxa" w:w="4608"/>
+          </w:tcPr>
+          <w:p>
+            <w:pPr>
+              <w:spacing w:after="40"/>
+            </w:pPr>
+            <w:r/>
+            <w:r>
+              <w:rPr>
+                <w:sz w:val="20"/>
+              </w:rPr>
+              <w:t>Staging sano después del rollback</w:t>
+            </w:r>
+          </w:p>
+        </w:tc>
+      </w:tr>
+      <w:tr>
+        <w:tc>
+          <w:tcPr>
+            <w:tcW w:type="dxa" w:w="4752"/>
+          </w:tcPr>
+          <w:p>
+            <w:pPr>
+              <w:spacing w:after="40"/>
+            </w:pPr>
+            <w:r/>
+            <w:r>
+              <w:rPr>
+                <w:sz w:val="20"/>
+              </w:rPr>
+              <w:t>15-historial-del-incidente.jpg</w:t>
+            </w:r>
+          </w:p>
+        </w:tc>
+        <w:tc>
+          <w:tcPr>
+            <w:tcW w:type="dxa" w:w="4608"/>
+          </w:tcPr>
+          <w:p>
+            <w:pPr>
+              <w:spacing w:after="40"/>
+            </w:pPr>
+            <w:r/>
+            <w:r>
+              <w:rPr>
+                <w:sz w:val="20"/>
+              </w:rPr>
+              <w:t>Despliegue de la corrección, sano</w:t>
             </w:r>
           </w:p>
         </w:tc>
@@ -4581,84 +4885,7 @@
         <w:pStyle w:val="Heading1"/>
       </w:pPr>
       <w:r>
-        <w:t>Anexo B — Archivos creados y modificados</w:t>
-      </w:r>
-    </w:p>
-    <w:p>
-      <w:pPr>
-        <w:spacing w:before="120" w:after="200" w:line="240" w:lineRule="auto"/>
-        <w:ind w:left="216"/>
-        <w:shd w:val="clear" w:color="auto" w:fill="F2F2F2"/>
-      </w:pPr>
-      <w:r>
-        <w:rPr>
-          <w:rFonts w:ascii="Consolas" w:hAnsi="Consolas" w:eastAsia="Consolas"/>
-          <w:sz w:val="17"/>
-        </w:rPr>
-        <w:t>CREADOS</w:t>
-        <w:br/>
-      </w:r>
-      <w:r>
-        <w:rPr>
-          <w:rFonts w:ascii="Consolas" w:hAnsi="Consolas" w:eastAsia="Consolas"/>
-          <w:sz w:val="17"/>
-        </w:rPr>
-        <w:t xml:space="preserve">  railway.json                     Dockerfile a construir y healthcheck path</w:t>
-        <w:br/>
-      </w:r>
-      <w:r>
-        <w:rPr>
-          <w:rFonts w:ascii="Consolas" w:hAnsi="Consolas" w:eastAsia="Consolas"/>
-          <w:sz w:val="17"/>
-        </w:rPr>
-        <w:br/>
-      </w:r>
-      <w:r>
-        <w:rPr>
-          <w:rFonts w:ascii="Consolas" w:hAnsi="Consolas" w:eastAsia="Consolas"/>
-          <w:sz w:val="17"/>
-        </w:rPr>
-        <w:t>MODIFICADOS</w:t>
-        <w:br/>
-      </w:r>
-      <w:r>
-        <w:rPr>
-          <w:rFonts w:ascii="Consolas" w:hAnsi="Consolas" w:eastAsia="Consolas"/>
-          <w:sz w:val="17"/>
-        </w:rPr>
-        <w:t xml:space="preserve">  .github/workflows/ci.yml         workflow_dispatch + jobs deploy-staging</w:t>
-        <w:br/>
-      </w:r>
-      <w:r>
-        <w:rPr>
-          <w:rFonts w:ascii="Consolas" w:hAnsi="Consolas" w:eastAsia="Consolas"/>
-          <w:sz w:val="17"/>
-        </w:rPr>
-        <w:t xml:space="preserve">                                   y deploy-produccion</w:t>
-        <w:br/>
-      </w:r>
-      <w:r>
-        <w:rPr>
-          <w:rFonts w:ascii="Consolas" w:hAnsi="Consolas" w:eastAsia="Consolas"/>
-          <w:sz w:val="17"/>
-        </w:rPr>
-        <w:t xml:space="preserve">  src/server/app.js                Ruta /health junto a /salud</w:t>
-        <w:br/>
-      </w:r>
-      <w:r>
-        <w:rPr>
-          <w:rFonts w:ascii="Consolas" w:hAnsi="Consolas" w:eastAsia="Consolas"/>
-          <w:sz w:val="17"/>
-        </w:rPr>
-        <w:t xml:space="preserve">  tests/salud-y-errores.test.js    Prueba de la ruta /health</w:t>
-      </w:r>
-    </w:p>
-    <w:p>
-      <w:pPr>
-        <w:pStyle w:val="Heading1"/>
-      </w:pPr>
-      <w:r>
-        <w:t>Anexo C — Estado del pipeline al cerrar la sesión</w:t>
+        <w:t>Anexo B — Pull Requests de la sesión</w:t>
       </w:r>
     </w:p>
     <w:tbl>
@@ -4676,7 +4903,7 @@
       <w:tr>
         <w:tc>
           <w:tcPr>
-            <w:tcW w:type="dxa" w:w="3168"/>
+            <w:tcW w:type="dxa" w:w="864"/>
             <w:shd w:val="clear" w:color="auto" w:fill="1F4E79"/>
           </w:tcPr>
           <w:p>
@@ -4690,13 +4917,13 @@
                 <w:color w:val="FFFFFF"/>
                 <w:sz w:val="20"/>
               </w:rPr>
-              <w:t>Job</w:t>
+              <w:t>PR</w:t>
             </w:r>
           </w:p>
         </w:tc>
         <w:tc>
           <w:tcPr>
-            <w:tcW w:type="dxa" w:w="4752"/>
+            <w:tcW w:type="dxa" w:w="5904"/>
             <w:shd w:val="clear" w:color="auto" w:fill="1F4E79"/>
           </w:tcPr>
           <w:p>
@@ -4710,13 +4937,13 @@
                 <w:color w:val="FFFFFF"/>
                 <w:sz w:val="20"/>
               </w:rPr>
-              <w:t>Cuándo corre</w:t>
+              <w:t>Título</w:t>
             </w:r>
           </w:p>
         </w:tc>
         <w:tc>
           <w:tcPr>
-            <w:tcW w:type="dxa" w:w="1440"/>
+            <w:tcW w:type="dxa" w:w="2592"/>
             <w:shd w:val="clear" w:color="auto" w:fill="1F4E79"/>
           </w:tcPr>
           <w:p>
@@ -4730,7 +4957,7 @@
                 <w:color w:val="FFFFFF"/>
                 <w:sz w:val="20"/>
               </w:rPr>
-              <w:t>Duración</w:t>
+              <w:t>Resultado</w:t>
             </w:r>
           </w:p>
         </w:tc>
@@ -4738,7 +4965,7 @@
       <w:tr>
         <w:tc>
           <w:tcPr>
-            <w:tcW w:type="dxa" w:w="3168"/>
+            <w:tcW w:type="dxa" w:w="864"/>
           </w:tcPr>
           <w:p>
             <w:pPr>
@@ -4749,13 +4976,13 @@
               <w:rPr>
                 <w:sz w:val="20"/>
               </w:rPr>
-              <w:t>Lint &amp; Build</w:t>
+              <w:t>#10</w:t>
             </w:r>
           </w:p>
         </w:tc>
         <w:tc>
           <w:tcPr>
-            <w:tcW w:type="dxa" w:w="4752"/>
+            <w:tcW w:type="dxa" w:w="5904"/>
           </w:tcPr>
           <w:p>
             <w:pPr>
@@ -4766,13 +4993,13 @@
               <w:rPr>
                 <w:sz w:val="20"/>
               </w:rPr>
-              <w:t>Siempre</w:t>
+              <w:t>Desplegar a staging tras el merge y a producción con confirmación</w:t>
             </w:r>
           </w:p>
         </w:tc>
         <w:tc>
           <w:tcPr>
-            <w:tcW w:type="dxa" w:w="1440"/>
+            <w:tcW w:type="dxa" w:w="2592"/>
           </w:tcPr>
           <w:p>
             <w:pPr>
@@ -4783,7 +5010,7 @@
               <w:rPr>
                 <w:sz w:val="20"/>
               </w:rPr>
-              <w:t>18s</w:t>
+              <w:t>Integrado</w:t>
             </w:r>
           </w:p>
         </w:tc>
@@ -4791,7 +5018,7 @@
       <w:tr>
         <w:tc>
           <w:tcPr>
-            <w:tcW w:type="dxa" w:w="3168"/>
+            <w:tcW w:type="dxa" w:w="864"/>
           </w:tcPr>
           <w:p>
             <w:pPr>
@@ -4802,13 +5029,13 @@
               <w:rPr>
                 <w:sz w:val="20"/>
               </w:rPr>
-              <w:t>Pruebas unitarias y cobertura</w:t>
+              <w:t>#12</w:t>
             </w:r>
           </w:p>
         </w:tc>
         <w:tc>
           <w:tcPr>
-            <w:tcW w:type="dxa" w:w="4752"/>
+            <w:tcW w:type="dxa" w:w="5904"/>
           </w:tcPr>
           <w:p>
             <w:pPr>
@@ -4819,13 +5046,13 @@
               <w:rPr>
                 <w:sz w:val="20"/>
               </w:rPr>
-              <w:t>Siempre</w:t>
+              <w:t>Invocar el servicio de Railway por su nombre real</w:t>
             </w:r>
           </w:p>
         </w:tc>
         <w:tc>
           <w:tcPr>
-            <w:tcW w:type="dxa" w:w="1440"/>
+            <w:tcW w:type="dxa" w:w="2592"/>
           </w:tcPr>
           <w:p>
             <w:pPr>
@@ -4836,7 +5063,7 @@
               <w:rPr>
                 <w:sz w:val="20"/>
               </w:rPr>
-              <w:t>14s</w:t>
+              <w:t>Integrado</w:t>
             </w:r>
           </w:p>
         </w:tc>
@@ -4844,7 +5071,7 @@
       <w:tr>
         <w:tc>
           <w:tcPr>
-            <w:tcW w:type="dxa" w:w="3168"/>
+            <w:tcW w:type="dxa" w:w="864"/>
           </w:tcPr>
           <w:p>
             <w:pPr>
@@ -4855,13 +5082,13 @@
               <w:rPr>
                 <w:sz w:val="20"/>
               </w:rPr>
-              <w:t>Migraciones y Seeds</w:t>
+              <w:t>#13</w:t>
             </w:r>
           </w:p>
         </w:tc>
         <w:tc>
           <w:tcPr>
-            <w:tcW w:type="dxa" w:w="4752"/>
+            <w:tcW w:type="dxa" w:w="5904"/>
           </w:tcPr>
           <w:p>
             <w:pPr>
@@ -4872,13 +5099,13 @@
               <w:rPr>
                 <w:sz w:val="20"/>
               </w:rPr>
-              <w:t>Siempre</w:t>
+              <w:t>Desplegar con el token de cuenta de Railway</w:t>
             </w:r>
           </w:p>
         </w:tc>
         <w:tc>
           <w:tcPr>
-            <w:tcW w:type="dxa" w:w="1440"/>
+            <w:tcW w:type="dxa" w:w="2592"/>
           </w:tcPr>
           <w:p>
             <w:pPr>
@@ -4889,7 +5116,7 @@
               <w:rPr>
                 <w:sz w:val="20"/>
               </w:rPr>
-              <w:t>31s</w:t>
+              <w:t>Integrado, luego reemplazado</w:t>
             </w:r>
           </w:p>
         </w:tc>
@@ -4897,7 +5124,7 @@
       <w:tr>
         <w:tc>
           <w:tcPr>
-            <w:tcW w:type="dxa" w:w="3168"/>
+            <w:tcW w:type="dxa" w:w="864"/>
           </w:tcPr>
           <w:p>
             <w:pPr>
@@ -4908,13 +5135,13 @@
               <w:rPr>
                 <w:sz w:val="20"/>
               </w:rPr>
-              <w:t>Pruebas E2E</w:t>
+              <w:t>#14</w:t>
             </w:r>
           </w:p>
         </w:tc>
         <w:tc>
           <w:tcPr>
-            <w:tcW w:type="dxa" w:w="4752"/>
+            <w:tcW w:type="dxa" w:w="5904"/>
           </w:tcPr>
           <w:p>
             <w:pPr>
@@ -4925,13 +5152,13 @@
               <w:rPr>
                 <w:sz w:val="20"/>
               </w:rPr>
-              <w:t>Siempre</w:t>
+              <w:t>Desplegar con un token de proyecto por ambiente</w:t>
             </w:r>
           </w:p>
         </w:tc>
         <w:tc>
           <w:tcPr>
-            <w:tcW w:type="dxa" w:w="1440"/>
+            <w:tcW w:type="dxa" w:w="2592"/>
           </w:tcPr>
           <w:p>
             <w:pPr>
@@ -4942,7 +5169,7 @@
               <w:rPr>
                 <w:sz w:val="20"/>
               </w:rPr>
-              <w:t>44s</w:t>
+              <w:t>Integrado</w:t>
             </w:r>
           </w:p>
         </w:tc>
@@ -4950,7 +5177,7 @@
       <w:tr>
         <w:tc>
           <w:tcPr>
-            <w:tcW w:type="dxa" w:w="3168"/>
+            <w:tcW w:type="dxa" w:w="864"/>
           </w:tcPr>
           <w:p>
             <w:pPr>
@@ -4961,13 +5188,13 @@
               <w:rPr>
                 <w:sz w:val="20"/>
               </w:rPr>
-              <w:t>Deploy a Staging</w:t>
+              <w:t>#15</w:t>
             </w:r>
           </w:p>
         </w:tc>
         <w:tc>
           <w:tcPr>
-            <w:tcW w:type="dxa" w:w="4752"/>
+            <w:tcW w:type="dxa" w:w="5904"/>
           </w:tcPr>
           <w:p>
             <w:pPr>
@@ -4978,13 +5205,13 @@
               <w:rPr>
                 <w:sz w:val="20"/>
               </w:rPr>
-              <w:t>Solo en push a main, tras los cuatro anteriores</w:t>
+              <w:t>Simulacro de caos: validar la base de datos al arrancar</w:t>
             </w:r>
           </w:p>
         </w:tc>
         <w:tc>
           <w:tcPr>
-            <w:tcW w:type="dxa" w:w="1440"/>
+            <w:tcW w:type="dxa" w:w="2592"/>
           </w:tcPr>
           <w:p>
             <w:pPr>
@@ -4995,7 +5222,7 @@
               <w:rPr>
                 <w:sz w:val="20"/>
               </w:rPr>
-              <w:t>4s</w:t>
+              <w:t>Integrado (error intencional)</w:t>
             </w:r>
           </w:p>
         </w:tc>
@@ -5003,7 +5230,7 @@
       <w:tr>
         <w:tc>
           <w:tcPr>
-            <w:tcW w:type="dxa" w:w="3168"/>
+            <w:tcW w:type="dxa" w:w="864"/>
           </w:tcPr>
           <w:p>
             <w:pPr>
@@ -5014,13 +5241,13 @@
               <w:rPr>
                 <w:sz w:val="20"/>
               </w:rPr>
-              <w:t>Deploy a Producción (manual)</w:t>
+              <w:t>#16</w:t>
             </w:r>
           </w:p>
         </w:tc>
         <w:tc>
           <w:tcPr>
-            <w:tcW w:type="dxa" w:w="4752"/>
+            <w:tcW w:type="dxa" w:w="5904"/>
           </w:tcPr>
           <w:p>
             <w:pPr>
@@ -5031,13 +5258,13 @@
               <w:rPr>
                 <w:sz w:val="20"/>
               </w:rPr>
-              <w:t>Solo con workflow_dispatch y confirmación DEPLOY</w:t>
+              <w:t>Corregir el nombre de DATABASE_URL en el arranque</w:t>
             </w:r>
           </w:p>
         </w:tc>
         <w:tc>
           <w:tcPr>
-            <w:tcW w:type="dxa" w:w="1440"/>
+            <w:tcW w:type="dxa" w:w="2592"/>
           </w:tcPr>
           <w:p>
             <w:pPr>
@@ -5048,7 +5275,7 @@
               <w:rPr>
                 <w:sz w:val="20"/>
               </w:rPr>
-              <w:t>—</w:t>
+              <w:t>Integrado</w:t>
             </w:r>
           </w:p>
         </w:tc>
@@ -5058,44 +5285,6 @@
       <w:pPr>
         <w:spacing w:after="40"/>
       </w:pPr>
-    </w:p>
-    <w:p>
-      <w:pPr>
-        <w:spacing w:before="120" w:after="200" w:line="240" w:lineRule="auto"/>
-        <w:ind w:left="216"/>
-        <w:shd w:val="clear" w:color="auto" w:fill="F2F2F2"/>
-      </w:pPr>
-      <w:r>
-        <w:rPr>
-          <w:rFonts w:ascii="Consolas" w:hAnsi="Consolas" w:eastAsia="Consolas"/>
-          <w:sz w:val="17"/>
-        </w:rPr>
-        <w:t>Run #16 — push a main (4bd5b86)</w:t>
-        <w:br/>
-      </w:r>
-      <w:r>
-        <w:rPr>
-          <w:rFonts w:ascii="Consolas" w:hAnsi="Consolas" w:eastAsia="Consolas"/>
-          <w:sz w:val="17"/>
-        </w:rPr>
-        <w:t>Status: Success · 54s</w:t>
-        <w:br/>
-      </w:r>
-      <w:r>
-        <w:rPr>
-          <w:rFonts w:ascii="Consolas" w:hAnsi="Consolas" w:eastAsia="Consolas"/>
-          <w:sz w:val="17"/>
-        </w:rPr>
-        <w:t>Test Files: 7 passes · 7 total</w:t>
-        <w:br/>
-      </w:r>
-      <w:r>
-        <w:rPr>
-          <w:rFonts w:ascii="Consolas" w:hAnsi="Consolas" w:eastAsia="Consolas"/>
-          <w:sz w:val="17"/>
-        </w:rPr>
-        <w:t>Test Results: 60 passes · 60 total</w:t>
-      </w:r>
     </w:p>
     <w:sectPr>
       <w:pgSz w:w="12240" w:h="15840"/>

</xml_diff>